<commit_message>
Expand reusable speaking examples
</commit_message>
<xml_diff>
--- a/speaking-material.docx
+++ b/speaking-material.docx
@@ -1291,16 +1291,14 @@
     <w:p>
       <w:pPr>
         <w:spacing w:after="20"/>
-        <w:ind w:left="259"/>
+        <w:ind w:left="173"/>
       </w:pPr>
       <w:r>
         <w:rPr>
           <w:rFonts w:ascii="Arial" w:hAnsi="Arial" w:eastAsia="微软雅黑"/>
-          <w:i/>
-          <w:color w:val="505050"/>
-          <w:sz w:val="19"/>
+          <w:sz w:val="20"/>
         </w:rPr>
-        <w:t>→ Goal 题可加：I chose it as one of my goals because I want to spend more time outdoors and stay active.</w:t>
+        <w:t>• It also gives me a good chance to spend quality time with my friends.</w:t>
       </w:r>
     </w:p>
     <w:p>
@@ -1315,7 +1313,7 @@
           <w:color w:val="505050"/>
           <w:sz w:val="19"/>
         </w:rPr>
-        <w:t>→ It also gives me a good chance to spend quality time with my friends.</w:t>
+        <w:t>→ Goal 题可加：I chose it as one of my goals because I want to spend more time outdoors and stay active.</w:t>
       </w:r>
     </w:p>
     <w:p>
@@ -1456,6 +1454,19 @@
     </w:p>
     <w:p>
       <w:pPr>
+        <w:spacing w:after="20"/>
+        <w:ind w:left="173"/>
+      </w:pPr>
+      <w:r>
+        <w:rPr>
+          <w:rFonts w:ascii="Arial" w:hAnsi="Arial" w:eastAsia="微软雅黑"/>
+          <w:sz w:val="20"/>
+        </w:rPr>
+        <w:t>• It also taught me to be more patient and responsible.</w:t>
+      </w:r>
+    </w:p>
+    <w:p>
+      <w:pPr>
         <w:pStyle w:val="4"/>
         <w:spacing w:before="100" w:after="40"/>
       </w:pPr>
@@ -1503,6 +1514,19 @@
           <w:sz w:val="20"/>
         </w:rPr>
         <w:t>• Overall, the weather is quite mild, so it is easy to plan outdoor activities.</w:t>
+      </w:r>
+    </w:p>
+    <w:p>
+      <w:pPr>
+        <w:spacing w:after="20"/>
+        <w:ind w:left="173"/>
+      </w:pPr>
+      <w:r>
+        <w:rPr>
+          <w:rFonts w:ascii="Arial" w:hAnsi="Arial" w:eastAsia="微软雅黑"/>
+          <w:sz w:val="20"/>
+        </w:rPr>
+        <w:t>• It also gives me more chances to spend time outdoors.</w:t>
       </w:r>
     </w:p>
     <w:p>
@@ -1558,6 +1582,19 @@
     </w:p>
     <w:p>
       <w:pPr>
+        <w:spacing w:after="20"/>
+        <w:ind w:left="173"/>
+      </w:pPr>
+      <w:r>
+        <w:rPr>
+          <w:rFonts w:ascii="Arial" w:hAnsi="Arial" w:eastAsia="微软雅黑"/>
+          <w:sz w:val="20"/>
+        </w:rPr>
+        <w:t>• As a result, I feel calmer and more prepared when the weather changes.</w:t>
+      </w:r>
+    </w:p>
+    <w:p>
+      <w:pPr>
         <w:pStyle w:val="4"/>
         <w:spacing w:before="100" w:after="40"/>
       </w:pPr>
@@ -1609,6 +1646,19 @@
     </w:p>
     <w:p>
       <w:pPr>
+        <w:spacing w:after="20"/>
+        <w:ind w:left="173"/>
+      </w:pPr>
+      <w:r>
+        <w:rPr>
+          <w:rFonts w:ascii="Arial" w:hAnsi="Arial" w:eastAsia="微软雅黑"/>
+          <w:sz w:val="20"/>
+        </w:rPr>
+        <w:t>• As a result, I feel more energetic and focused the next day.</w:t>
+      </w:r>
+    </w:p>
+    <w:p>
+      <w:pPr>
         <w:pStyle w:val="4"/>
         <w:spacing w:before="100" w:after="40"/>
       </w:pPr>
@@ -1656,6 +1706,19 @@
           <w:sz w:val="20"/>
         </w:rPr>
         <w:t>• This makes it easier for me to maintain a healthy routine.</w:t>
+      </w:r>
+    </w:p>
+    <w:p>
+      <w:pPr>
+        <w:spacing w:after="20"/>
+        <w:ind w:left="173"/>
+      </w:pPr>
+      <w:r>
+        <w:rPr>
+          <w:rFonts w:ascii="Arial" w:hAnsi="Arial" w:eastAsia="微软雅黑"/>
+          <w:sz w:val="20"/>
+        </w:rPr>
+        <w:t>• As a result, I feel more energetic and focused during the day.</w:t>
       </w:r>
     </w:p>
     <w:p>
@@ -1802,6 +1865,19 @@
     </w:p>
     <w:p>
       <w:pPr>
+        <w:spacing w:after="20"/>
+        <w:ind w:left="173"/>
+      </w:pPr>
+      <w:r>
+        <w:rPr>
+          <w:rFonts w:ascii="Arial" w:hAnsi="Arial" w:eastAsia="微软雅黑"/>
+          <w:sz w:val="20"/>
+        </w:rPr>
+        <w:t>• As a result, I can shop more efficiently and stay within my budget.</w:t>
+      </w:r>
+    </w:p>
+    <w:p>
+      <w:pPr>
         <w:pStyle w:val="4"/>
         <w:spacing w:before="100" w:after="40"/>
       </w:pPr>
@@ -1849,6 +1925,19 @@
           <w:sz w:val="20"/>
         </w:rPr>
         <w:t>• That made the shopping experience easy and helped me avoid buying the wrong size.</w:t>
+      </w:r>
+    </w:p>
+    <w:p>
+      <w:pPr>
+        <w:spacing w:after="20"/>
+        <w:ind w:left="173"/>
+      </w:pPr>
+      <w:r>
+        <w:rPr>
+          <w:rFonts w:ascii="Arial" w:hAnsi="Arial" w:eastAsia="微软雅黑"/>
+          <w:sz w:val="20"/>
+        </w:rPr>
+        <w:t>• As a result, I felt more confident about my choice.</w:t>
       </w:r>
     </w:p>
     <w:p>
@@ -1904,6 +1993,19 @@
     </w:p>
     <w:p>
       <w:pPr>
+        <w:spacing w:after="20"/>
+        <w:ind w:left="173"/>
+      </w:pPr>
+      <w:r>
+        <w:rPr>
+          <w:rFonts w:ascii="Arial" w:hAnsi="Arial" w:eastAsia="微软雅黑"/>
+          <w:sz w:val="20"/>
+        </w:rPr>
+        <w:t>• It also gives me a chance to see the world from different perspectives.</w:t>
+      </w:r>
+    </w:p>
+    <w:p>
+      <w:pPr>
         <w:pStyle w:val="4"/>
         <w:spacing w:before="100" w:after="40"/>
       </w:pPr>
@@ -1951,6 +2053,19 @@
           <w:sz w:val="20"/>
         </w:rPr>
         <w:t>• Learning about it gives me a chance to understand more about Chinese history and culture.</w:t>
+      </w:r>
+    </w:p>
+    <w:p>
+      <w:pPr>
+        <w:spacing w:after="20"/>
+        <w:ind w:left="173"/>
+      </w:pPr>
+      <w:r>
+        <w:rPr>
+          <w:rFonts w:ascii="Arial" w:hAnsi="Arial" w:eastAsia="微软雅黑"/>
+          <w:sz w:val="20"/>
+        </w:rPr>
+        <w:t>• It also gives me a chance to learn how people lived in the past.</w:t>
       </w:r>
     </w:p>
     <w:p>
@@ -2006,6 +2121,19 @@
     </w:p>
     <w:p>
       <w:pPr>
+        <w:spacing w:after="20"/>
+        <w:ind w:left="173"/>
+      </w:pPr>
+      <w:r>
+        <w:rPr>
+          <w:rFonts w:ascii="Arial" w:hAnsi="Arial" w:eastAsia="微软雅黑"/>
+          <w:sz w:val="20"/>
+        </w:rPr>
+        <w:t>• As a result, I became more confident when talking to strangers.</w:t>
+      </w:r>
+    </w:p>
+    <w:p>
+      <w:pPr>
         <w:pStyle w:val="4"/>
         <w:spacing w:before="100" w:after="40"/>
       </w:pPr>
@@ -2053,6 +2181,19 @@
           <w:sz w:val="20"/>
         </w:rPr>
         <w:t>• It gives us a good chance to spend quality time together and brings us closer.</w:t>
+      </w:r>
+    </w:p>
+    <w:p>
+      <w:pPr>
+        <w:spacing w:after="20"/>
+        <w:ind w:left="173"/>
+      </w:pPr>
+      <w:r>
+        <w:rPr>
+          <w:rFonts w:ascii="Arial" w:hAnsi="Arial" w:eastAsia="微软雅黑"/>
+          <w:sz w:val="20"/>
+        </w:rPr>
+        <w:t>• It also helps me understand and appreciate my family traditions.</w:t>
       </w:r>
     </w:p>
     <w:p>
@@ -2107,10 +2248,19 @@
       </w:r>
     </w:p>
     <w:p>
+      <w:pPr>
+        <w:spacing w:after="20"/>
+        <w:ind w:left="173"/>
+      </w:pPr>
       <w:r>
-        <w:br w:type="page"/>
+        <w:rPr>
+          <w:rFonts w:ascii="Arial" w:hAnsi="Arial" w:eastAsia="微软雅黑"/>
+          <w:sz w:val="20"/>
+        </w:rPr>
+        <w:t>• It also helps me stay focused when I study or work.</w:t>
       </w:r>
     </w:p>
+    <w:p/>
     <w:p>
       <w:pPr>
         <w:pStyle w:val="3"/>

</xml_diff>

<commit_message>
Add concrete details to speaking examples
</commit_message>
<xml_diff>
--- a/speaking-material.docx
+++ b/speaking-material.docx
@@ -1249,7 +1249,7 @@
     </w:p>
     <w:p>
       <w:pPr>
-        <w:spacing w:after="20"/>
+        <w:spacing w:after="0"/>
         <w:ind w:left="173"/>
       </w:pPr>
       <w:r>
@@ -1264,7 +1264,20 @@
     </w:p>
     <w:p>
       <w:pPr>
-        <w:spacing w:after="20"/>
+        <w:spacing w:after="0"/>
+        <w:ind w:left="173"/>
+      </w:pPr>
+      <w:r>
+        <w:rPr>
+          <w:rFonts w:ascii="Arial" w:hAnsi="Arial" w:eastAsia="微软雅黑"/>
+          <w:sz w:val="20"/>
+        </w:rPr>
+        <w:t>• We usually choose an easy trail and take a short break near the top.</w:t>
+      </w:r>
+    </w:p>
+    <w:p>
+      <w:pPr>
+        <w:spacing w:after="0"/>
         <w:ind w:left="173"/>
       </w:pPr>
       <w:r>
@@ -1277,7 +1290,7 @@
     </w:p>
     <w:p>
       <w:pPr>
-        <w:spacing w:after="20"/>
+        <w:spacing w:after="0"/>
         <w:ind w:left="173"/>
       </w:pPr>
       <w:r>
@@ -1290,7 +1303,7 @@
     </w:p>
     <w:p>
       <w:pPr>
-        <w:spacing w:after="20"/>
+        <w:spacing w:after="0"/>
         <w:ind w:left="173"/>
       </w:pPr>
       <w:r>
@@ -1415,7 +1428,7 @@
     </w:p>
     <w:p>
       <w:pPr>
-        <w:spacing w:after="20"/>
+        <w:spacing w:after="0"/>
         <w:ind w:left="173"/>
       </w:pPr>
       <w:r>
@@ -1428,7 +1441,7 @@
     </w:p>
     <w:p>
       <w:pPr>
-        <w:spacing w:after="20"/>
+        <w:spacing w:after="0"/>
         <w:ind w:left="173"/>
       </w:pPr>
       <w:r>
@@ -1441,7 +1454,20 @@
     </w:p>
     <w:p>
       <w:pPr>
-        <w:spacing w:after="20"/>
+        <w:spacing w:after="0"/>
+        <w:ind w:left="173"/>
+      </w:pPr>
+      <w:r>
+        <w:rPr>
+          <w:rFonts w:ascii="Arial" w:hAnsi="Arial" w:eastAsia="微软雅黑"/>
+          <w:sz w:val="20"/>
+        </w:rPr>
+        <w:t>• I kept it near a sunny window and checked the soil every morning.</w:t>
+      </w:r>
+    </w:p>
+    <w:p>
+      <w:pPr>
+        <w:spacing w:after="0"/>
         <w:ind w:left="173"/>
       </w:pPr>
       <w:r>
@@ -1454,7 +1480,7 @@
     </w:p>
     <w:p>
       <w:pPr>
-        <w:spacing w:after="20"/>
+        <w:spacing w:after="0"/>
         <w:ind w:left="173"/>
       </w:pPr>
       <w:r>
@@ -1479,7 +1505,7 @@
     </w:p>
     <w:p>
       <w:pPr>
-        <w:spacing w:after="20"/>
+        <w:spacing w:after="0"/>
         <w:ind w:left="173"/>
       </w:pPr>
       <w:r>
@@ -1492,7 +1518,20 @@
     </w:p>
     <w:p>
       <w:pPr>
-        <w:spacing w:after="20"/>
+        <w:spacing w:after="0"/>
+        <w:ind w:left="173"/>
+      </w:pPr>
+      <w:r>
+        <w:rPr>
+          <w:rFonts w:ascii="Arial" w:hAnsi="Arial" w:eastAsia="微软雅黑"/>
+          <w:sz w:val="20"/>
+        </w:rPr>
+        <w:t>• On sunny weekends, I often go for a walk in a nearby park.</w:t>
+      </w:r>
+    </w:p>
+    <w:p>
+      <w:pPr>
+        <w:spacing w:after="0"/>
         <w:ind w:left="173"/>
       </w:pPr>
       <w:r>
@@ -1505,7 +1544,7 @@
     </w:p>
     <w:p>
       <w:pPr>
-        <w:spacing w:after="20"/>
+        <w:spacing w:after="0"/>
         <w:ind w:left="173"/>
       </w:pPr>
       <w:r>
@@ -1518,7 +1557,7 @@
     </w:p>
     <w:p>
       <w:pPr>
-        <w:spacing w:after="20"/>
+        <w:spacing w:after="0"/>
         <w:ind w:left="173"/>
       </w:pPr>
       <w:r>
@@ -1543,7 +1582,7 @@
     </w:p>
     <w:p>
       <w:pPr>
-        <w:spacing w:after="20"/>
+        <w:spacing w:after="0"/>
         <w:ind w:left="173"/>
       </w:pPr>
       <w:r>
@@ -1556,7 +1595,7 @@
     </w:p>
     <w:p>
       <w:pPr>
-        <w:spacing w:after="20"/>
+        <w:spacing w:after="0"/>
         <w:ind w:left="173"/>
       </w:pPr>
       <w:r>
@@ -1569,7 +1608,20 @@
     </w:p>
     <w:p>
       <w:pPr>
-        <w:spacing w:after="20"/>
+        <w:spacing w:after="0"/>
+        <w:ind w:left="173"/>
+      </w:pPr>
+      <w:r>
+        <w:rPr>
+          <w:rFonts w:ascii="Arial" w:hAnsi="Arial" w:eastAsia="微软雅黑"/>
+          <w:sz w:val="20"/>
+        </w:rPr>
+        <w:t>• For example, during heavy rain, I leave home early and avoid flooded roads.</w:t>
+      </w:r>
+    </w:p>
+    <w:p>
+      <w:pPr>
+        <w:spacing w:after="0"/>
         <w:ind w:left="173"/>
       </w:pPr>
       <w:r>
@@ -1582,7 +1634,7 @@
     </w:p>
     <w:p>
       <w:pPr>
-        <w:spacing w:after="20"/>
+        <w:spacing w:after="0"/>
         <w:ind w:left="173"/>
       </w:pPr>
       <w:r>
@@ -1607,7 +1659,7 @@
     </w:p>
     <w:p>
       <w:pPr>
-        <w:spacing w:after="20"/>
+        <w:spacing w:after="0"/>
         <w:ind w:left="173"/>
       </w:pPr>
       <w:r>
@@ -1620,7 +1672,7 @@
     </w:p>
     <w:p>
       <w:pPr>
-        <w:spacing w:after="20"/>
+        <w:spacing w:after="0"/>
         <w:ind w:left="173"/>
       </w:pPr>
       <w:r>
@@ -1633,7 +1685,20 @@
     </w:p>
     <w:p>
       <w:pPr>
-        <w:spacing w:after="20"/>
+        <w:spacing w:after="0"/>
+        <w:ind w:left="173"/>
+      </w:pPr>
+      <w:r>
+        <w:rPr>
+          <w:rFonts w:ascii="Arial" w:hAnsi="Arial" w:eastAsia="微软雅黑"/>
+          <w:sz w:val="20"/>
+        </w:rPr>
+        <w:t>• I also put my phone away about thirty minutes before bedtime.</w:t>
+      </w:r>
+    </w:p>
+    <w:p>
+      <w:pPr>
+        <w:spacing w:after="0"/>
         <w:ind w:left="173"/>
       </w:pPr>
       <w:r>
@@ -1646,7 +1711,7 @@
     </w:p>
     <w:p>
       <w:pPr>
-        <w:spacing w:after="20"/>
+        <w:spacing w:after="0"/>
         <w:ind w:left="173"/>
       </w:pPr>
       <w:r>
@@ -1671,7 +1736,7 @@
     </w:p>
     <w:p>
       <w:pPr>
-        <w:spacing w:after="20"/>
+        <w:spacing w:after="0"/>
         <w:ind w:left="173"/>
       </w:pPr>
       <w:r>
@@ -1684,7 +1749,20 @@
     </w:p>
     <w:p>
       <w:pPr>
-        <w:spacing w:after="20"/>
+        <w:spacing w:after="0"/>
+        <w:ind w:left="173"/>
+      </w:pPr>
+      <w:r>
+        <w:rPr>
+          <w:rFonts w:ascii="Arial" w:hAnsi="Arial" w:eastAsia="微软雅黑"/>
+          <w:sz w:val="20"/>
+        </w:rPr>
+        <w:t>• For example, I often have eggs and vegetables for breakfast.</w:t>
+      </w:r>
+    </w:p>
+    <w:p>
+      <w:pPr>
+        <w:spacing w:after="0"/>
         <w:ind w:left="173"/>
       </w:pPr>
       <w:r>
@@ -1697,7 +1775,7 @@
     </w:p>
     <w:p>
       <w:pPr>
-        <w:spacing w:after="20"/>
+        <w:spacing w:after="0"/>
         <w:ind w:left="173"/>
       </w:pPr>
       <w:r>
@@ -1710,7 +1788,7 @@
     </w:p>
     <w:p>
       <w:pPr>
-        <w:spacing w:after="20"/>
+        <w:spacing w:after="0"/>
         <w:ind w:left="173"/>
       </w:pPr>
       <w:r>
@@ -1826,7 +1904,7 @@
     </w:p>
     <w:p>
       <w:pPr>
-        <w:spacing w:after="20"/>
+        <w:spacing w:after="0"/>
         <w:ind w:left="173"/>
       </w:pPr>
       <w:r>
@@ -1839,7 +1917,7 @@
     </w:p>
     <w:p>
       <w:pPr>
-        <w:spacing w:after="20"/>
+        <w:spacing w:after="0"/>
         <w:ind w:left="173"/>
       </w:pPr>
       <w:r>
@@ -1852,7 +1930,20 @@
     </w:p>
     <w:p>
       <w:pPr>
-        <w:spacing w:after="20"/>
+        <w:spacing w:after="0"/>
+        <w:ind w:left="173"/>
+      </w:pPr>
+      <w:r>
+        <w:rPr>
+          <w:rFonts w:ascii="Arial" w:hAnsi="Arial" w:eastAsia="微软雅黑"/>
+          <w:sz w:val="20"/>
+        </w:rPr>
+        <w:t>• For example, I read several customer reviews before I buy electronics.</w:t>
+      </w:r>
+    </w:p>
+    <w:p>
+      <w:pPr>
+        <w:spacing w:after="0"/>
         <w:ind w:left="173"/>
       </w:pPr>
       <w:r>
@@ -1865,7 +1956,7 @@
     </w:p>
     <w:p>
       <w:pPr>
-        <w:spacing w:after="20"/>
+        <w:spacing w:after="0"/>
         <w:ind w:left="173"/>
       </w:pPr>
       <w:r>
@@ -1890,7 +1981,7 @@
     </w:p>
     <w:p>
       <w:pPr>
-        <w:spacing w:after="20"/>
+        <w:spacing w:after="0"/>
         <w:ind w:left="173"/>
       </w:pPr>
       <w:r>
@@ -1903,7 +1994,7 @@
     </w:p>
     <w:p>
       <w:pPr>
-        <w:spacing w:after="20"/>
+        <w:spacing w:after="0"/>
         <w:ind w:left="173"/>
       </w:pPr>
       <w:r>
@@ -1916,7 +2007,20 @@
     </w:p>
     <w:p>
       <w:pPr>
-        <w:spacing w:after="20"/>
+        <w:spacing w:after="0"/>
+        <w:ind w:left="173"/>
+      </w:pPr>
+      <w:r>
+        <w:rPr>
+          <w:rFonts w:ascii="Arial" w:hAnsi="Arial" w:eastAsia="微软雅黑"/>
+          <w:sz w:val="20"/>
+        </w:rPr>
+        <w:t>• I walked around the store for a few minutes to make sure they were comfortable.</w:t>
+      </w:r>
+    </w:p>
+    <w:p>
+      <w:pPr>
+        <w:spacing w:after="0"/>
         <w:ind w:left="173"/>
       </w:pPr>
       <w:r>
@@ -1929,7 +2033,7 @@
     </w:p>
     <w:p>
       <w:pPr>
-        <w:spacing w:after="20"/>
+        <w:spacing w:after="0"/>
         <w:ind w:left="173"/>
       </w:pPr>
       <w:r>
@@ -1954,7 +2058,7 @@
     </w:p>
     <w:p>
       <w:pPr>
-        <w:spacing w:after="20"/>
+        <w:spacing w:after="0"/>
         <w:ind w:left="173"/>
       </w:pPr>
       <w:r>
@@ -1967,7 +2071,20 @@
     </w:p>
     <w:p>
       <w:pPr>
-        <w:spacing w:after="20"/>
+        <w:spacing w:after="0"/>
+        <w:ind w:left="173"/>
+      </w:pPr>
+      <w:r>
+        <w:rPr>
+          <w:rFonts w:ascii="Arial" w:hAnsi="Arial" w:eastAsia="微软雅黑"/>
+          <w:sz w:val="20"/>
+        </w:rPr>
+        <w:t>• I usually read a few pages before bed when the room is quiet.</w:t>
+      </w:r>
+    </w:p>
+    <w:p>
+      <w:pPr>
+        <w:spacing w:after="0"/>
         <w:ind w:left="173"/>
       </w:pPr>
       <w:r>
@@ -1980,7 +2097,7 @@
     </w:p>
     <w:p>
       <w:pPr>
-        <w:spacing w:after="20"/>
+        <w:spacing w:after="0"/>
         <w:ind w:left="173"/>
       </w:pPr>
       <w:r>
@@ -1993,7 +2110,7 @@
     </w:p>
     <w:p>
       <w:pPr>
-        <w:spacing w:after="20"/>
+        <w:spacing w:after="0"/>
         <w:ind w:left="173"/>
       </w:pPr>
       <w:r>
@@ -2018,7 +2135,7 @@
     </w:p>
     <w:p>
       <w:pPr>
-        <w:spacing w:after="20"/>
+        <w:spacing w:after="0"/>
         <w:ind w:left="173"/>
       </w:pPr>
       <w:r>
@@ -2031,7 +2148,7 @@
     </w:p>
     <w:p>
       <w:pPr>
-        <w:spacing w:after="20"/>
+        <w:spacing w:after="0"/>
         <w:ind w:left="173"/>
       </w:pPr>
       <w:r>
@@ -2044,7 +2161,20 @@
     </w:p>
     <w:p>
       <w:pPr>
-        <w:spacing w:after="20"/>
+        <w:spacing w:after="0"/>
+        <w:ind w:left="173"/>
+      </w:pPr>
+      <w:r>
+        <w:rPr>
+          <w:rFonts w:ascii="Arial" w:hAnsi="Arial" w:eastAsia="微软雅黑"/>
+          <w:sz w:val="20"/>
+        </w:rPr>
+        <w:t>• Its long stone walls and watchtowers stretch across the mountains.</w:t>
+      </w:r>
+    </w:p>
+    <w:p>
+      <w:pPr>
+        <w:spacing w:after="0"/>
         <w:ind w:left="173"/>
       </w:pPr>
       <w:r>
@@ -2057,7 +2187,7 @@
     </w:p>
     <w:p>
       <w:pPr>
-        <w:spacing w:after="20"/>
+        <w:spacing w:after="0"/>
         <w:ind w:left="173"/>
       </w:pPr>
       <w:r>
@@ -2082,7 +2212,7 @@
     </w:p>
     <w:p>
       <w:pPr>
-        <w:spacing w:after="20"/>
+        <w:spacing w:after="0"/>
         <w:ind w:left="173"/>
       </w:pPr>
       <w:r>
@@ -2095,7 +2225,7 @@
     </w:p>
     <w:p>
       <w:pPr>
-        <w:spacing w:after="20"/>
+        <w:spacing w:after="0"/>
         <w:ind w:left="173"/>
       </w:pPr>
       <w:r>
@@ -2108,7 +2238,20 @@
     </w:p>
     <w:p>
       <w:pPr>
-        <w:spacing w:after="20"/>
+        <w:spacing w:after="0"/>
+        <w:ind w:left="173"/>
+      </w:pPr>
+      <w:r>
+        <w:rPr>
+          <w:rFonts w:ascii="Arial" w:hAnsi="Arial" w:eastAsia="微软雅黑"/>
+          <w:sz w:val="20"/>
+        </w:rPr>
+        <w:t>• One afternoon, I helped a student find a history book for a school project.</w:t>
+      </w:r>
+    </w:p>
+    <w:p>
+      <w:pPr>
+        <w:spacing w:after="0"/>
         <w:ind w:left="173"/>
       </w:pPr>
       <w:r>
@@ -2121,7 +2264,7 @@
     </w:p>
     <w:p>
       <w:pPr>
-        <w:spacing w:after="20"/>
+        <w:spacing w:after="0"/>
         <w:ind w:left="173"/>
       </w:pPr>
       <w:r>
@@ -2146,7 +2289,7 @@
     </w:p>
     <w:p>
       <w:pPr>
-        <w:spacing w:after="20"/>
+        <w:spacing w:after="0"/>
         <w:ind w:left="173"/>
       </w:pPr>
       <w:r>
@@ -2159,7 +2302,7 @@
     </w:p>
     <w:p>
       <w:pPr>
-        <w:spacing w:after="20"/>
+        <w:spacing w:after="0"/>
         <w:ind w:left="173"/>
       </w:pPr>
       <w:r>
@@ -2172,7 +2315,20 @@
     </w:p>
     <w:p>
       <w:pPr>
-        <w:spacing w:after="20"/>
+        <w:spacing w:after="0"/>
+        <w:ind w:left="173"/>
+      </w:pPr>
+      <w:r>
+        <w:rPr>
+          <w:rFonts w:ascii="Arial" w:hAnsi="Arial" w:eastAsia="微软雅黑"/>
+          <w:sz w:val="20"/>
+        </w:rPr>
+        <w:t>• For example, during the Spring Festival, we make dumplings together.</w:t>
+      </w:r>
+    </w:p>
+    <w:p>
+      <w:pPr>
+        <w:spacing w:after="0"/>
         <w:ind w:left="173"/>
       </w:pPr>
       <w:r>
@@ -2185,7 +2341,7 @@
     </w:p>
     <w:p>
       <w:pPr>
-        <w:spacing w:after="20"/>
+        <w:spacing w:after="0"/>
         <w:ind w:left="173"/>
       </w:pPr>
       <w:r>
@@ -2210,7 +2366,7 @@
     </w:p>
     <w:p>
       <w:pPr>
-        <w:spacing w:after="20"/>
+        <w:spacing w:after="0"/>
         <w:ind w:left="173"/>
       </w:pPr>
       <w:r>
@@ -2223,7 +2379,20 @@
     </w:p>
     <w:p>
       <w:pPr>
-        <w:spacing w:after="20"/>
+        <w:spacing w:after="0"/>
+        <w:ind w:left="173"/>
+      </w:pPr>
+      <w:r>
+        <w:rPr>
+          <w:rFonts w:ascii="Arial" w:hAnsi="Arial" w:eastAsia="微软雅黑"/>
+          <w:sz w:val="20"/>
+        </w:rPr>
+        <w:t>• I often listen to a short piano piece while I review my notes.</w:t>
+      </w:r>
+    </w:p>
+    <w:p>
+      <w:pPr>
+        <w:spacing w:after="0"/>
         <w:ind w:left="173"/>
       </w:pPr>
       <w:r>
@@ -2236,7 +2405,7 @@
     </w:p>
     <w:p>
       <w:pPr>
-        <w:spacing w:after="20"/>
+        <w:spacing w:after="0"/>
         <w:ind w:left="173"/>
       </w:pPr>
       <w:r>
@@ -2249,7 +2418,7 @@
     </w:p>
     <w:p>
       <w:pPr>
-        <w:spacing w:after="20"/>
+        <w:spacing w:after="0"/>
         <w:ind w:left="173"/>
       </w:pPr>
       <w:r>

</xml_diff>

<commit_message>
Sync latest speaking examples
</commit_message>
<xml_diff>
--- a/speaking-material.docx
+++ b/speaking-material.docx
@@ -1181,7 +1181,7 @@
         <w:rPr>
           <w:rFonts w:ascii="Arial" w:hAnsi="Arial" w:eastAsia="微软雅黑"/>
         </w:rPr>
-        <w:t>PART 2｜16 个高复用例子</w:t>
+        <w:t>PART 2｜18 个高复用例子</w:t>
       </w:r>
     </w:p>
     <w:p>
@@ -1193,7 +1193,83 @@
         <w:rPr>
           <w:rFonts w:ascii="Arial" w:hAnsi="Arial" w:eastAsia="微软雅黑"/>
         </w:rPr>
-        <w:t>1｜交通出行：School shuttle</w:t>
+        <w:t>1｜工作与远程办公：Work experience + remote work（GTRT 36⭐）</w:t>
+      </w:r>
+    </w:p>
+    <w:p>
+      <w:pPr>
+        <w:spacing w:after="20"/>
+        <w:ind w:left="173"/>
+      </w:pPr>
+      <w:r>
+        <w:rPr>
+          <w:rFonts w:ascii="Arial" w:hAnsi="Arial" w:eastAsia="微软雅黑"/>
+          <w:sz w:val="20"/>
+        </w:rPr>
+        <w:t>• I currently work in a research laboratory, where I plan experiments, record the results, and analyze the data. For example, one experiment kept failing, so I searched online and asked a senior lab member for help.</w:t>
+      </w:r>
+    </w:p>
+    <w:p>
+      <w:pPr>
+        <w:spacing w:after="20"/>
+        <w:ind w:left="173"/>
+      </w:pPr>
+      <w:r>
+        <w:rPr>
+          <w:rFonts w:ascii="Arial" w:hAnsi="Arial" w:eastAsia="微软雅黑"/>
+          <w:sz w:val="20"/>
+        </w:rPr>
+        <w:t>• I would prefer to work from home two days a week because it saves commuting time and makes my schedule more flexible. However, I would still go to the lab when experiments or teamwork are required. This would help me keep a better work-life balance without making communication more difficult.</w:t>
+      </w:r>
+    </w:p>
+    <w:p>
+      <w:pPr>
+        <w:pStyle w:val="4"/>
+        <w:spacing w:before="100" w:after="40"/>
+      </w:pPr>
+      <w:r>
+        <w:rPr>
+          <w:rFonts w:ascii="Arial" w:hAnsi="Arial" w:eastAsia="微软雅黑"/>
+        </w:rPr>
+        <w:t>2｜科技与社交媒体：Technology + social media（GTRT 37⭐）</w:t>
+      </w:r>
+    </w:p>
+    <w:p>
+      <w:pPr>
+        <w:spacing w:after="20"/>
+        <w:ind w:left="173"/>
+      </w:pPr>
+      <w:r>
+        <w:rPr>
+          <w:rFonts w:ascii="Arial" w:hAnsi="Arial" w:eastAsia="微软雅黑"/>
+          <w:sz w:val="20"/>
+        </w:rPr>
+        <w:t>• I use my phone and computer every day for messaging friends, reading papers, and organizing my schedule. For example, I use WeChat to stay in touch with close friends and my laptop to analyze research data. Once a program stopped working before I saved my work, so now I save my files regularly and keep a backup.</w:t>
+      </w:r>
+    </w:p>
+    <w:p>
+      <w:pPr>
+        <w:spacing w:after="20"/>
+        <w:ind w:left="173"/>
+      </w:pPr>
+      <w:r>
+        <w:rPr>
+          <w:rFonts w:ascii="Arial" w:hAnsi="Arial" w:eastAsia="微软雅黑"/>
+          <w:sz w:val="20"/>
+        </w:rPr>
+        <w:t>• Technology saves me a lot of time and makes my daily life easier, but I try not to scroll without a clear purpose. I only share simple daily updates online and never post private information. When I study or meet friends, I put my phone away so I can focus and have face-to-face conversations.</w:t>
+      </w:r>
+    </w:p>
+    <w:p>
+      <w:pPr>
+        <w:pStyle w:val="4"/>
+        <w:spacing w:before="100" w:after="40"/>
+      </w:pPr>
+      <w:r>
+        <w:rPr>
+          <w:rFonts w:ascii="Arial" w:hAnsi="Arial" w:eastAsia="微软雅黑"/>
+        </w:rPr>
+        <w:t>3｜交通出行：School shuttle</w:t>
       </w:r>
     </w:p>
     <w:p>
@@ -1244,35 +1320,33 @@
         <w:rPr>
           <w:rFonts w:ascii="Arial" w:hAnsi="Arial" w:eastAsia="微软雅黑"/>
         </w:rPr>
-        <w:t>2｜户外活动：Hiking with friends</w:t>
+        <w:t>4｜户外活动：Hiking with friends</w:t>
       </w:r>
     </w:p>
     <w:p>
       <w:pPr>
         <w:spacing w:after="0"/>
         <w:ind w:left="173"/>
+        <w:rPr>
+          <w:rFonts w:hint="eastAsia" w:eastAsia="微软雅黑"/>
+          <w:sz w:val="20"/>
+          <w:lang w:val="en-US" w:eastAsia="zh-CN"/>
+        </w:rPr>
       </w:pPr>
       <w:r>
         <w:rPr>
           <w:rFonts w:ascii="Arial" w:hAnsi="Arial" w:eastAsia="微软雅黑"/>
           <w:sz w:val="20"/>
         </w:rPr>
-        <w:t>• I like going hiking with my friends.</w:t>
+        <w:t>• I  go hiking with my friends.</w:t>
       </w:r>
-      <w:bookmarkStart w:id="0" w:name="_GoBack"/>
-      <w:bookmarkEnd w:id="0"/>
-    </w:p>
-    <w:p>
-      <w:pPr>
-        <w:spacing w:after="0"/>
-        <w:ind w:left="173"/>
-      </w:pPr>
       <w:r>
         <w:rPr>
-          <w:rFonts w:ascii="Arial" w:hAnsi="Arial" w:eastAsia="微软雅黑"/>
+          <w:rFonts w:hint="eastAsia" w:eastAsia="微软雅黑"/>
           <w:sz w:val="20"/>
-        </w:rPr>
-        <w:t>• We usually choose an easy trail and take a short break near the top.</w:t>
+          <w:lang w:val="en-US" w:eastAsia="zh-CN"/>
+        </w:rPr>
+        <w:t>considering the mountain is near our school,we often go there by school shuttle.</w:t>
       </w:r>
     </w:p>
     <w:p>
@@ -1338,7 +1412,7 @@
         <w:rPr>
           <w:rFonts w:ascii="Arial" w:hAnsi="Arial" w:eastAsia="微软雅黑"/>
         </w:rPr>
-        <w:t>3｜环保：少开空调 + 太阳能板</w:t>
+        <w:t>5｜环保：少开空调 + 太阳能板</w:t>
       </w:r>
     </w:p>
     <w:p>
@@ -1423,7 +1497,7 @@
         <w:rPr>
           <w:rFonts w:ascii="Arial" w:hAnsi="Arial" w:eastAsia="微软雅黑"/>
         </w:rPr>
-        <w:t>4｜种植：一株玫瑰</w:t>
+        <w:t>6｜种植：一株玫瑰</w:t>
       </w:r>
     </w:p>
     <w:p>
@@ -1436,46 +1510,37 @@
           <w:rFonts w:ascii="Arial" w:hAnsi="Arial" w:eastAsia="微软雅黑"/>
           <w:sz w:val="20"/>
         </w:rPr>
-        <w:t>• I once grew a rose at home.</w:t>
+        <w:t xml:space="preserve">• I once grew a rose at home.I watered it regularly and </w:t>
       </w:r>
-    </w:p>
-    <w:p>
-      <w:pPr>
-        <w:spacing w:after="0"/>
-        <w:ind w:left="173"/>
-      </w:pPr>
+      <w:r>
+        <w:rPr>
+          <w:rFonts w:hint="eastAsia" w:eastAsia="微软雅黑"/>
+          <w:sz w:val="20"/>
+          <w:lang w:val="en-US" w:eastAsia="zh-CN"/>
+        </w:rPr>
+        <w:t>wiped out</w:t>
+      </w:r>
       <w:r>
         <w:rPr>
           <w:rFonts w:ascii="Arial" w:hAnsi="Arial" w:eastAsia="微软雅黑"/>
           <w:sz w:val="20"/>
         </w:rPr>
-        <w:t>• I watered it regularly and removed weeds around it.</w:t>
+        <w:t xml:space="preserve"> weeds around it.I kept it near </w:t>
       </w:r>
-    </w:p>
-    <w:p>
-      <w:pPr>
-        <w:spacing w:after="0"/>
-        <w:ind w:left="173"/>
-      </w:pPr>
+      <w:r>
+        <w:rPr>
+          <w:rFonts w:hint="eastAsia" w:eastAsia="微软雅黑"/>
+          <w:sz w:val="20"/>
+          <w:lang w:val="en-US" w:eastAsia="zh-CN"/>
+        </w:rPr>
+        <w:t>my</w:t>
+      </w:r>
       <w:r>
         <w:rPr>
           <w:rFonts w:ascii="Arial" w:hAnsi="Arial" w:eastAsia="微软雅黑"/>
           <w:sz w:val="20"/>
         </w:rPr>
-        <w:t>• I kept it near a sunny window and checked the soil every morning.</w:t>
-      </w:r>
-    </w:p>
-    <w:p>
-      <w:pPr>
-        <w:spacing w:after="0"/>
-        <w:ind w:left="173"/>
-      </w:pPr>
-      <w:r>
-        <w:rPr>
-          <w:rFonts w:ascii="Arial" w:hAnsi="Arial" w:eastAsia="微软雅黑"/>
-          <w:sz w:val="20"/>
-        </w:rPr>
-        <w:t>• Taking care of it was simple, but it made me feel relaxed and gave me a sense of achievement.</w:t>
+        <w:t xml:space="preserve"> window and checked the soil every morning.Taking care of it was simple, but it made me feel relaxed and gave me a sense of achievement.</w:t>
       </w:r>
     </w:p>
     <w:p>
@@ -1500,7 +1565,62 @@
         <w:rPr>
           <w:rFonts w:ascii="Arial" w:hAnsi="Arial" w:eastAsia="微软雅黑"/>
         </w:rPr>
-        <w:t>5｜天气：晴天为主</w:t>
+        <w:t>7｜天气：晴天为主</w:t>
+      </w:r>
+    </w:p>
+    <w:p>
+      <w:pPr>
+        <w:spacing w:after="0"/>
+        <w:ind w:left="173"/>
+        <w:rPr>
+          <w:rFonts w:hint="default"/>
+          <w:lang w:val="en-US"/>
+        </w:rPr>
+      </w:pPr>
+      <w:r>
+        <w:rPr>
+          <w:rFonts w:ascii="Arial" w:hAnsi="Arial" w:eastAsia="微软雅黑"/>
+          <w:sz w:val="20"/>
+        </w:rPr>
+        <w:t>• The weather in my city is usually sunny and comfortable</w:t>
+      </w:r>
+      <w:r>
+        <w:rPr>
+          <w:rFonts w:hint="eastAsia" w:eastAsia="微软雅黑"/>
+          <w:sz w:val="20"/>
+          <w:lang w:val="en-US" w:eastAsia="zh-CN"/>
+        </w:rPr>
+        <w:t xml:space="preserve">,it rarely gets too hot or too cold.so </w:t>
+      </w:r>
+      <w:r>
+        <w:rPr>
+          <w:rFonts w:ascii="Arial" w:hAnsi="Arial" w:eastAsia="微软雅黑"/>
+          <w:sz w:val="20"/>
+        </w:rPr>
+        <w:t xml:space="preserve">I </w:t>
+      </w:r>
+      <w:r>
+        <w:rPr>
+          <w:rFonts w:hint="eastAsia" w:eastAsia="微软雅黑"/>
+          <w:sz w:val="20"/>
+          <w:lang w:val="en-US" w:eastAsia="zh-CN"/>
+        </w:rPr>
+        <w:t xml:space="preserve">like to take part in some outdoor activities on the weekends.i </w:t>
+      </w:r>
+      <w:r>
+        <w:rPr>
+          <w:rFonts w:ascii="Arial" w:hAnsi="Arial" w:eastAsia="微软雅黑"/>
+          <w:sz w:val="20"/>
+        </w:rPr>
+        <w:t xml:space="preserve">often go </w:t>
+      </w:r>
+      <w:r>
+        <w:rPr>
+          <w:rFonts w:hint="eastAsia" w:eastAsia="微软雅黑"/>
+          <w:sz w:val="20"/>
+          <w:lang w:val="en-US" w:eastAsia="zh-CN"/>
+        </w:rPr>
+        <w:t>hiking with my friends.</w:t>
       </w:r>
     </w:p>
     <w:p>
@@ -1513,7 +1633,120 @@
           <w:rFonts w:ascii="Arial" w:hAnsi="Arial" w:eastAsia="微软雅黑"/>
           <w:sz w:val="20"/>
         </w:rPr>
-        <w:t>• The weather in my city is usually sunny and comfortable.</w:t>
+        <w:t>• Sometimes it rains, especially in spring and summer</w:t>
+      </w:r>
+      <w:r>
+        <w:rPr>
+          <w:rFonts w:hint="eastAsia" w:eastAsia="微软雅黑"/>
+          <w:sz w:val="20"/>
+          <w:lang w:val="en-US" w:eastAsia="zh-CN"/>
+        </w:rPr>
+        <w:t>,so i need to check the weather forcast before going out.if it rains,i will take a umbrella with me.</w:t>
+      </w:r>
+      <w:r>
+        <w:rPr>
+          <w:rFonts w:ascii="Arial" w:hAnsi="Arial" w:eastAsia="微软雅黑"/>
+          <w:sz w:val="20"/>
+        </w:rPr>
+        <w:t>Overall, the weather is quite mild</w:t>
+      </w:r>
+      <w:r>
+        <w:rPr>
+          <w:rFonts w:hint="eastAsia" w:eastAsia="微软雅黑"/>
+          <w:sz w:val="20"/>
+          <w:lang w:val="en-US" w:eastAsia="zh-CN"/>
+        </w:rPr>
+        <w:t xml:space="preserve"> in my city</w:t>
+      </w:r>
+      <w:r>
+        <w:rPr>
+          <w:rFonts w:ascii="Arial" w:hAnsi="Arial" w:eastAsia="微软雅黑"/>
+          <w:sz w:val="20"/>
+        </w:rPr>
+        <w:t>, so it is easy to plan outdoor activities.</w:t>
+      </w:r>
+    </w:p>
+    <w:p>
+      <w:pPr>
+        <w:pStyle w:val="4"/>
+        <w:spacing w:before="100" w:after="40"/>
+      </w:pPr>
+      <w:r>
+        <w:rPr>
+          <w:rFonts w:ascii="Arial" w:hAnsi="Arial" w:eastAsia="微软雅黑"/>
+        </w:rPr>
+        <w:t>8｜极端天气：天气预报 + 雨伞</w:t>
+      </w:r>
+    </w:p>
+    <w:p>
+      <w:pPr>
+        <w:spacing w:after="0"/>
+        <w:ind w:left="173"/>
+        <w:rPr>
+          <w:rFonts w:hint="eastAsia" w:eastAsia="微软雅黑"/>
+          <w:sz w:val="20"/>
+          <w:lang w:val="en-US" w:eastAsia="zh-CN"/>
+        </w:rPr>
+      </w:pPr>
+      <w:r>
+        <w:rPr>
+          <w:rFonts w:ascii="Arial" w:hAnsi="Arial" w:eastAsia="微软雅黑"/>
+          <w:sz w:val="20"/>
+        </w:rPr>
+        <w:t xml:space="preserve">• I usually check the weather forecast before I go out. If rain or bad weather is </w:t>
+      </w:r>
+      <w:r>
+        <w:rPr>
+          <w:rFonts w:hint="eastAsia" w:eastAsia="微软雅黑"/>
+          <w:sz w:val="20"/>
+          <w:lang w:val="en-US" w:eastAsia="zh-CN"/>
+        </w:rPr>
+        <w:t>forecast</w:t>
+      </w:r>
+      <w:r>
+        <w:rPr>
+          <w:rFonts w:ascii="Arial" w:hAnsi="Arial" w:eastAsia="微软雅黑"/>
+          <w:sz w:val="20"/>
+        </w:rPr>
+        <w:t xml:space="preserve">, I bring an umbrella and prepare </w:t>
+      </w:r>
+      <w:r>
+        <w:rPr>
+          <w:rFonts w:hint="eastAsia" w:eastAsia="微软雅黑"/>
+          <w:sz w:val="20"/>
+          <w:lang w:val="en-US" w:eastAsia="zh-CN"/>
+        </w:rPr>
+        <w:t>a raincoat</w:t>
+      </w:r>
+      <w:r>
+        <w:rPr>
+          <w:rFonts w:ascii="Arial" w:hAnsi="Arial" w:eastAsia="微软雅黑"/>
+          <w:sz w:val="20"/>
+        </w:rPr>
+        <w:t>.This helps me avoid unnecessary problems</w:t>
+      </w:r>
+      <w:r>
+        <w:rPr>
+          <w:rFonts w:hint="eastAsia" w:eastAsia="微软雅黑"/>
+          <w:sz w:val="20"/>
+          <w:lang w:val="en-US" w:eastAsia="zh-CN"/>
+        </w:rPr>
+        <w:t xml:space="preserve"> and </w:t>
+      </w:r>
+      <w:r>
+        <w:rPr>
+          <w:rFonts w:ascii="Arial" w:hAnsi="Arial" w:eastAsia="微软雅黑"/>
+          <w:sz w:val="20"/>
+        </w:rPr>
+        <w:t xml:space="preserve">makes the situation </w:t>
+      </w:r>
+      <w:r>
+        <w:rPr>
+          <w:rFonts w:hint="eastAsia" w:eastAsia="微软雅黑"/>
+          <w:sz w:val="20"/>
+          <w:lang w:val="en-US" w:eastAsia="zh-CN"/>
+        </w:rPr>
+        <w:t>easier.</w:t>
       </w:r>
     </w:p>
     <w:p>
@@ -1526,7 +1759,181 @@
           <w:rFonts w:ascii="Arial" w:hAnsi="Arial" w:eastAsia="微软雅黑"/>
           <w:sz w:val="20"/>
         </w:rPr>
-        <w:t>• On sunny weekends, I often go for a walk in a nearby park.</w:t>
+        <w:t>• For example,</w:t>
+      </w:r>
+      <w:r>
+        <w:rPr>
+          <w:rFonts w:hint="eastAsia" w:eastAsia="微软雅黑"/>
+          <w:sz w:val="20"/>
+          <w:lang w:val="en-US" w:eastAsia="zh-CN"/>
+        </w:rPr>
+        <w:t>it rained heavily last Saturday.</w:t>
+      </w:r>
+      <w:r>
+        <w:rPr>
+          <w:rFonts w:ascii="Arial" w:hAnsi="Arial" w:eastAsia="微软雅黑"/>
+          <w:sz w:val="20"/>
+        </w:rPr>
+        <w:t xml:space="preserve"> </w:t>
+      </w:r>
+      <w:r>
+        <w:rPr>
+          <w:rFonts w:hint="eastAsia" w:eastAsia="微软雅黑"/>
+          <w:sz w:val="20"/>
+          <w:lang w:val="en-US" w:eastAsia="zh-CN"/>
+        </w:rPr>
+        <w:t>D</w:t>
+      </w:r>
+      <w:r>
+        <w:rPr>
+          <w:rFonts w:ascii="Arial" w:hAnsi="Arial" w:eastAsia="微软雅黑"/>
+          <w:sz w:val="20"/>
+        </w:rPr>
+        <w:t>uring</w:t>
+      </w:r>
+      <w:r>
+        <w:rPr>
+          <w:rFonts w:hint="eastAsia" w:eastAsia="微软雅黑"/>
+          <w:sz w:val="20"/>
+          <w:lang w:val="en-US" w:eastAsia="zh-CN"/>
+        </w:rPr>
+        <w:t xml:space="preserve"> the</w:t>
+      </w:r>
+      <w:r>
+        <w:rPr>
+          <w:rFonts w:ascii="Arial" w:hAnsi="Arial" w:eastAsia="微软雅黑"/>
+          <w:sz w:val="20"/>
+        </w:rPr>
+        <w:t xml:space="preserve"> heavy rain, I lea</w:t>
+      </w:r>
+      <w:r>
+        <w:rPr>
+          <w:rFonts w:hint="eastAsia" w:eastAsia="微软雅黑"/>
+          <w:sz w:val="20"/>
+          <w:lang w:val="en-US" w:eastAsia="zh-CN"/>
+        </w:rPr>
+        <w:t>f</w:t>
+      </w:r>
+      <w:r>
+        <w:rPr>
+          <w:rFonts w:ascii="Arial" w:hAnsi="Arial" w:eastAsia="微软雅黑"/>
+          <w:sz w:val="20"/>
+        </w:rPr>
+        <w:t xml:space="preserve"> home early and </w:t>
+      </w:r>
+      <w:r>
+        <w:rPr>
+          <w:rFonts w:hint="eastAsia" w:eastAsia="微软雅黑"/>
+          <w:sz w:val="20"/>
+          <w:lang w:val="en-US" w:eastAsia="zh-CN"/>
+        </w:rPr>
+        <w:t>took a taxi</w:t>
+      </w:r>
+      <w:r>
+        <w:rPr>
+          <w:rFonts w:ascii="Arial" w:hAnsi="Arial" w:eastAsia="微软雅黑"/>
+          <w:sz w:val="20"/>
+        </w:rPr>
+        <w:t>.</w:t>
+      </w:r>
+      <w:r>
+        <w:rPr>
+          <w:rFonts w:hint="eastAsia" w:eastAsia="微软雅黑"/>
+          <w:sz w:val="20"/>
+          <w:lang w:val="en-US" w:eastAsia="zh-CN"/>
+        </w:rPr>
+        <w:t>i also took an umbrella with me .so i didn</w:t>
+      </w:r>
+      <w:r>
+        <w:rPr>
+          <w:rFonts w:hint="default" w:eastAsia="微软雅黑"/>
+          <w:sz w:val="20"/>
+          <w:lang w:val="en-US" w:eastAsia="zh-CN"/>
+        </w:rPr>
+        <w:t>’</w:t>
+      </w:r>
+      <w:r>
+        <w:rPr>
+          <w:rFonts w:hint="eastAsia" w:eastAsia="微软雅黑"/>
+          <w:sz w:val="20"/>
+          <w:lang w:val="en-US" w:eastAsia="zh-CN"/>
+        </w:rPr>
+        <w:t xml:space="preserve">t get wet.it also helps me improve my skills when i meet some bad weather. </w:t>
+      </w:r>
+      <w:r>
+        <w:rPr>
+          <w:rFonts w:ascii="Arial" w:hAnsi="Arial" w:eastAsia="微软雅黑"/>
+          <w:sz w:val="20"/>
+        </w:rPr>
+        <w:t xml:space="preserve"> As a result, I feel calmer and more prepared when the weather changes.</w:t>
+      </w:r>
+    </w:p>
+    <w:p>
+      <w:pPr>
+        <w:pStyle w:val="4"/>
+        <w:spacing w:before="100" w:after="40"/>
+      </w:pPr>
+      <w:r>
+        <w:rPr>
+          <w:rFonts w:ascii="Arial" w:hAnsi="Arial" w:eastAsia="微软雅黑"/>
+        </w:rPr>
+        <w:t>9｜睡眠：固定 schedule</w:t>
+      </w:r>
+    </w:p>
+    <w:p>
+      <w:pPr>
+        <w:spacing w:after="0"/>
+        <w:ind w:left="173"/>
+        <w:rPr>
+          <w:rFonts w:hint="eastAsia" w:eastAsia="微软雅黑"/>
+          <w:sz w:val="20"/>
+          <w:lang w:val="en-US" w:eastAsia="zh-CN"/>
+        </w:rPr>
+      </w:pPr>
+      <w:r>
+        <w:rPr>
+          <w:rFonts w:ascii="Arial" w:hAnsi="Arial" w:eastAsia="微软雅黑"/>
+          <w:sz w:val="20"/>
+        </w:rPr>
+        <w:t xml:space="preserve">• I usually go to bed early and </w:t>
+      </w:r>
+      <w:r>
+        <w:rPr>
+          <w:rFonts w:hint="eastAsia" w:eastAsia="微软雅黑"/>
+          <w:sz w:val="20"/>
+          <w:lang w:val="en-US" w:eastAsia="zh-CN"/>
+        </w:rPr>
+        <w:t>sleep about 8 hours a day.this helps me</w:t>
+      </w:r>
+      <w:r>
+        <w:rPr>
+          <w:rFonts w:ascii="Arial" w:hAnsi="Arial" w:eastAsia="微软雅黑"/>
+          <w:sz w:val="20"/>
+        </w:rPr>
+        <w:t xml:space="preserve"> to keep a </w:t>
+      </w:r>
+      <w:r>
+        <w:rPr>
+          <w:rFonts w:hint="eastAsia" w:eastAsia="微软雅黑"/>
+          <w:sz w:val="20"/>
+          <w:lang w:val="en-US" w:eastAsia="zh-CN"/>
+        </w:rPr>
+        <w:t>healthy</w:t>
+      </w:r>
+      <w:r>
+        <w:rPr>
+          <w:rFonts w:ascii="Arial" w:hAnsi="Arial" w:eastAsia="微软雅黑"/>
+          <w:sz w:val="20"/>
+        </w:rPr>
+        <w:t xml:space="preserve"> sleep schedule.Before bed, I listen to some quiet music and  drink a glass of milk.</w:t>
+      </w:r>
+      <w:r>
+        <w:rPr>
+          <w:rFonts w:hint="eastAsia" w:eastAsia="微软雅黑"/>
+          <w:sz w:val="20"/>
+          <w:lang w:val="en-US" w:eastAsia="zh-CN"/>
+        </w:rPr>
+        <w:t>this is a good way to help me relax and clear my mind.</w:t>
       </w:r>
     </w:p>
     <w:p>
@@ -1536,10 +1943,56 @@
       </w:pPr>
       <w:r>
         <w:rPr>
+          <w:rFonts w:hint="eastAsia" w:eastAsia="微软雅黑"/>
+          <w:sz w:val="20"/>
+          <w:lang w:val="en-US" w:eastAsia="zh-CN"/>
+        </w:rPr>
+        <w:t>Xxxx.</w:t>
+      </w:r>
+      <w:r>
+        <w:rPr>
           <w:rFonts w:ascii="Arial" w:hAnsi="Arial" w:eastAsia="微软雅黑"/>
           <w:sz w:val="20"/>
         </w:rPr>
-        <w:t>• Sometimes it rains, especially in spring and summer.</w:t>
+        <w:t>I also put my phone away about thirty minutes before bedtime.This makes it easier for me to fall asleep.</w:t>
+      </w:r>
+    </w:p>
+    <w:p>
+      <w:pPr>
+        <w:spacing w:after="0"/>
+        <w:ind w:left="173"/>
+        <w:rPr>
+          <w:rFonts w:hint="default" w:eastAsia="微软雅黑"/>
+          <w:lang w:val="en-US" w:eastAsia="zh-CN"/>
+        </w:rPr>
+      </w:pPr>
+      <w:r>
+        <w:rPr>
+          <w:rFonts w:ascii="Arial" w:hAnsi="Arial" w:eastAsia="微软雅黑"/>
+          <w:sz w:val="20"/>
+          <w:szCs w:val="20"/>
+        </w:rPr>
+        <w:t xml:space="preserve"> It is good for my physical health and gives me more energy.</w:t>
+      </w:r>
+      <w:r>
+        <w:rPr>
+          <w:rFonts w:hint="eastAsia" w:eastAsia="微软雅黑"/>
+          <w:sz w:val="20"/>
+          <w:lang w:val="en-US" w:eastAsia="zh-CN"/>
+        </w:rPr>
+        <w:t>i can understand xxxx</w:t>
+      </w:r>
+    </w:p>
+    <w:p>
+      <w:pPr>
+        <w:pStyle w:val="4"/>
+        <w:spacing w:before="100" w:after="40"/>
+      </w:pPr>
+      <w:r>
+        <w:rPr>
+          <w:rFonts w:ascii="Arial" w:hAnsi="Arial" w:eastAsia="微软雅黑"/>
+        </w:rPr>
+        <w:t>10｜饮食：蔬菜 + 蛋白质</w:t>
       </w:r>
     </w:p>
     <w:p>
@@ -1552,7 +2005,7 @@
           <w:rFonts w:ascii="Arial" w:hAnsi="Arial" w:eastAsia="微软雅黑"/>
           <w:sz w:val="20"/>
         </w:rPr>
-        <w:t>• Overall, the weather is quite mild, so it is easy to plan outdoor activities.</w:t>
+        <w:t>• I usually eat vegetables and some protein, such as eggs and chicken. For example, I often have eggs and vegetables for breakfast.</w:t>
       </w:r>
     </w:p>
     <w:p>
@@ -1565,7 +2018,7 @@
           <w:rFonts w:ascii="Arial" w:hAnsi="Arial" w:eastAsia="微软雅黑"/>
           <w:sz w:val="20"/>
         </w:rPr>
-        <w:t>• It also gives me more chances to spend time outdoors.</w:t>
+        <w:t>• These foods are good for my physical health and give me more energy. They also make it easier for me to keep a healthy routine.</w:t>
       </w:r>
     </w:p>
     <w:p>
@@ -1577,238 +2030,7 @@
         <w:rPr>
           <w:rFonts w:ascii="Arial" w:hAnsi="Arial" w:eastAsia="微软雅黑"/>
         </w:rPr>
-        <w:t>6｜极端天气：天气预报 + 雨伞</w:t>
-      </w:r>
-    </w:p>
-    <w:p>
-      <w:pPr>
-        <w:spacing w:after="0"/>
-        <w:ind w:left="173"/>
-      </w:pPr>
-      <w:r>
-        <w:rPr>
-          <w:rFonts w:ascii="Arial" w:hAnsi="Arial" w:eastAsia="微软雅黑"/>
-          <w:sz w:val="20"/>
-        </w:rPr>
-        <w:t>• I usually check the weather forecast before I go out.</w:t>
-      </w:r>
-    </w:p>
-    <w:p>
-      <w:pPr>
-        <w:spacing w:after="0"/>
-        <w:ind w:left="173"/>
-      </w:pPr>
-      <w:r>
-        <w:rPr>
-          <w:rFonts w:ascii="Arial" w:hAnsi="Arial" w:eastAsia="微软雅黑"/>
-          <w:sz w:val="20"/>
-        </w:rPr>
-        <w:t>• If rain or bad weather is expected, I bring an umbrella and prepare suitable clothes.</w:t>
-      </w:r>
-    </w:p>
-    <w:p>
-      <w:pPr>
-        <w:spacing w:after="0"/>
-        <w:ind w:left="173"/>
-      </w:pPr>
-      <w:r>
-        <w:rPr>
-          <w:rFonts w:ascii="Arial" w:hAnsi="Arial" w:eastAsia="微软雅黑"/>
-          <w:sz w:val="20"/>
-        </w:rPr>
-        <w:t>• For example, during heavy rain, I leave home early and avoid flooded roads.</w:t>
-      </w:r>
-    </w:p>
-    <w:p>
-      <w:pPr>
-        <w:spacing w:after="0"/>
-        <w:ind w:left="173"/>
-      </w:pPr>
-      <w:r>
-        <w:rPr>
-          <w:rFonts w:ascii="Arial" w:hAnsi="Arial" w:eastAsia="微软雅黑"/>
-          <w:sz w:val="20"/>
-        </w:rPr>
-        <w:t>• This makes the situation more predictable and helps me avoid unnecessary problems.</w:t>
-      </w:r>
-    </w:p>
-    <w:p>
-      <w:pPr>
-        <w:spacing w:after="0"/>
-        <w:ind w:left="173"/>
-      </w:pPr>
-      <w:r>
-        <w:rPr>
-          <w:rFonts w:ascii="Arial" w:hAnsi="Arial" w:eastAsia="微软雅黑"/>
-          <w:sz w:val="20"/>
-        </w:rPr>
-        <w:t>• As a result, I feel calmer and more prepared when the weather changes.</w:t>
-      </w:r>
-    </w:p>
-    <w:p>
-      <w:pPr>
-        <w:pStyle w:val="4"/>
-        <w:spacing w:before="100" w:after="40"/>
-      </w:pPr>
-      <w:r>
-        <w:rPr>
-          <w:rFonts w:ascii="Arial" w:hAnsi="Arial" w:eastAsia="微软雅黑"/>
-        </w:rPr>
-        <w:t>7｜睡眠：固定 schedule</w:t>
-      </w:r>
-    </w:p>
-    <w:p>
-      <w:pPr>
-        <w:spacing w:after="0"/>
-        <w:ind w:left="173"/>
-      </w:pPr>
-      <w:r>
-        <w:rPr>
-          <w:rFonts w:ascii="Arial" w:hAnsi="Arial" w:eastAsia="微软雅黑"/>
-          <w:sz w:val="20"/>
-        </w:rPr>
-        <w:t>• I usually go to bed early and try to keep a regular sleep schedule.</w:t>
-      </w:r>
-    </w:p>
-    <w:p>
-      <w:pPr>
-        <w:spacing w:after="0"/>
-        <w:ind w:left="173"/>
-      </w:pPr>
-      <w:r>
-        <w:rPr>
-          <w:rFonts w:ascii="Arial" w:hAnsi="Arial" w:eastAsia="微软雅黑"/>
-          <w:sz w:val="20"/>
-        </w:rPr>
-        <w:t>• Before bed, I listen to some quiet music and sometimes drink a glass of milk.</w:t>
-      </w:r>
-    </w:p>
-    <w:p>
-      <w:pPr>
-        <w:spacing w:after="0"/>
-        <w:ind w:left="173"/>
-      </w:pPr>
-      <w:r>
-        <w:rPr>
-          <w:rFonts w:ascii="Arial" w:hAnsi="Arial" w:eastAsia="微软雅黑"/>
-          <w:sz w:val="20"/>
-        </w:rPr>
-        <w:t>• I also put my phone away about thirty minutes before bedtime.</w:t>
-      </w:r>
-    </w:p>
-    <w:p>
-      <w:pPr>
-        <w:spacing w:after="0"/>
-        <w:ind w:left="173"/>
-      </w:pPr>
-      <w:r>
-        <w:rPr>
-          <w:rFonts w:ascii="Arial" w:hAnsi="Arial" w:eastAsia="微软雅黑"/>
-          <w:sz w:val="20"/>
-        </w:rPr>
-        <w:t>• This helps me relax and makes it easier for me to fall asleep.</w:t>
-      </w:r>
-    </w:p>
-    <w:p>
-      <w:pPr>
-        <w:spacing w:after="0"/>
-        <w:ind w:left="173"/>
-      </w:pPr>
-      <w:r>
-        <w:rPr>
-          <w:rFonts w:ascii="Arial" w:hAnsi="Arial" w:eastAsia="微软雅黑"/>
-          <w:sz w:val="20"/>
-        </w:rPr>
-        <w:t>• As a result, I feel more energetic and focused the next day.</w:t>
-      </w:r>
-    </w:p>
-    <w:p>
-      <w:pPr>
-        <w:pStyle w:val="4"/>
-        <w:spacing w:before="100" w:after="40"/>
-      </w:pPr>
-      <w:r>
-        <w:rPr>
-          <w:rFonts w:ascii="Arial" w:hAnsi="Arial" w:eastAsia="微软雅黑"/>
-        </w:rPr>
-        <w:t>8｜饮食：蔬菜 + 蛋白质</w:t>
-      </w:r>
-    </w:p>
-    <w:p>
-      <w:pPr>
-        <w:spacing w:after="0"/>
-        <w:ind w:left="173"/>
-      </w:pPr>
-      <w:r>
-        <w:rPr>
-          <w:rFonts w:ascii="Arial" w:hAnsi="Arial" w:eastAsia="微软雅黑"/>
-          <w:sz w:val="20"/>
-        </w:rPr>
-        <w:t>• I usually eat vegetables and some protein, such as eggs and chicken.</w:t>
-      </w:r>
-    </w:p>
-    <w:p>
-      <w:pPr>
-        <w:spacing w:after="0"/>
-        <w:ind w:left="173"/>
-      </w:pPr>
-      <w:r>
-        <w:rPr>
-          <w:rFonts w:ascii="Arial" w:hAnsi="Arial" w:eastAsia="微软雅黑"/>
-          <w:sz w:val="20"/>
-        </w:rPr>
-        <w:t>• For example, I often have eggs and vegetables for breakfast.</w:t>
-      </w:r>
-    </w:p>
-    <w:p>
-      <w:pPr>
-        <w:spacing w:after="0"/>
-        <w:ind w:left="173"/>
-      </w:pPr>
-      <w:r>
-        <w:rPr>
-          <w:rFonts w:ascii="Arial" w:hAnsi="Arial" w:eastAsia="微软雅黑"/>
-          <w:sz w:val="20"/>
-        </w:rPr>
-        <w:t>• These foods are simple, healthy, and give me enough energy during the day.</w:t>
-      </w:r>
-    </w:p>
-    <w:p>
-      <w:pPr>
-        <w:spacing w:after="0"/>
-        <w:ind w:left="173"/>
-      </w:pPr>
-      <w:r>
-        <w:rPr>
-          <w:rFonts w:ascii="Arial" w:hAnsi="Arial" w:eastAsia="微软雅黑"/>
-          <w:sz w:val="20"/>
-        </w:rPr>
-        <w:t>• This makes it easier for me to maintain a healthy routine.</w:t>
-      </w:r>
-    </w:p>
-    <w:p>
-      <w:pPr>
-        <w:spacing w:after="0"/>
-        <w:ind w:left="173"/>
-      </w:pPr>
-      <w:r>
-        <w:rPr>
-          <w:rFonts w:ascii="Arial" w:hAnsi="Arial" w:eastAsia="微软雅黑"/>
-          <w:sz w:val="20"/>
-        </w:rPr>
-        <w:t>• As a result, I feel more energetic and focused during the day.</w:t>
-      </w:r>
-    </w:p>
-    <w:p>
-      <w:pPr>
-        <w:pStyle w:val="4"/>
-        <w:spacing w:before="100" w:after="40"/>
-      </w:pPr>
-      <w:r>
-        <w:rPr>
-          <w:rFonts w:ascii="Arial" w:hAnsi="Arial" w:eastAsia="微软雅黑"/>
-        </w:rPr>
-        <w:t>9｜消费习惯：记录支出 list</w:t>
+        <w:t>11｜消费习惯：记录支出 list</w:t>
       </w:r>
     </w:p>
     <w:p>
@@ -1899,7 +2121,7 @@
         <w:rPr>
           <w:rFonts w:ascii="Arial" w:hAnsi="Arial" w:eastAsia="微软雅黑"/>
         </w:rPr>
-        <w:t>10｜网上购物：先比较再买</w:t>
+        <w:t>12｜网上购物：先比较再买</w:t>
       </w:r>
     </w:p>
     <w:p>
@@ -1912,7 +2134,62 @@
           <w:rFonts w:ascii="Arial" w:hAnsi="Arial" w:eastAsia="微软雅黑"/>
           <w:sz w:val="20"/>
         </w:rPr>
-        <w:t>• I like shopping online because it saves me a lot of time.</w:t>
+        <w:t>• I like shopping online</w:t>
+      </w:r>
+      <w:r>
+        <w:rPr>
+          <w:rFonts w:hint="eastAsia" w:eastAsia="微软雅黑"/>
+          <w:sz w:val="20"/>
+          <w:lang w:val="en-US" w:eastAsia="zh-CN"/>
+        </w:rPr>
+        <w:t>.</w:t>
+      </w:r>
+      <w:r>
+        <w:rPr>
+          <w:rFonts w:ascii="Arial" w:hAnsi="Arial" w:eastAsia="微软雅黑"/>
+          <w:sz w:val="20"/>
+        </w:rPr>
+        <w:t>Before buying something, I usually compare the price, quality, and reviews.</w:t>
+      </w:r>
+    </w:p>
+    <w:p>
+      <w:pPr>
+        <w:spacing w:after="0"/>
+        <w:rPr>
+          <w:rFonts w:ascii="Arial" w:hAnsi="Arial" w:eastAsia="微软雅黑"/>
+          <w:sz w:val="20"/>
+        </w:rPr>
+      </w:pPr>
+      <w:r>
+        <w:rPr>
+          <w:rFonts w:ascii="Arial" w:hAnsi="Arial" w:eastAsia="微软雅黑"/>
+          <w:sz w:val="20"/>
+        </w:rPr>
+        <w:t xml:space="preserve"> it saves me a lot of time and makes my daily life easier.</w:t>
+      </w:r>
+    </w:p>
+    <w:p>
+      <w:pPr>
+        <w:spacing w:after="0"/>
+      </w:pPr>
+      <w:r>
+        <w:rPr>
+          <w:rFonts w:ascii="Arial" w:hAnsi="Arial" w:eastAsia="微软雅黑"/>
+          <w:sz w:val="20"/>
+        </w:rPr>
+        <w:t xml:space="preserve"> • I also use a simple app to track every expense, so I can see where my money goes. This helps me avoid unnecessary spending and stay within my budget.</w:t>
+      </w:r>
+    </w:p>
+    <w:p>
+      <w:pPr>
+        <w:pStyle w:val="4"/>
+        <w:spacing w:before="100" w:after="40"/>
+      </w:pPr>
+      <w:r>
+        <w:rPr>
+          <w:rFonts w:ascii="Arial" w:hAnsi="Arial" w:eastAsia="微软雅黑"/>
+        </w:rPr>
+        <w:t>13｜线下购物：买鞋</w:t>
       </w:r>
     </w:p>
     <w:p>
@@ -1925,7 +2202,7 @@
           <w:rFonts w:ascii="Arial" w:hAnsi="Arial" w:eastAsia="微软雅黑"/>
           <w:sz w:val="20"/>
         </w:rPr>
-        <w:t>• Before buying something, I usually compare the price, quality, and reviews.</w:t>
+        <w:t>• I once bought a pair of shoes in a physical store. The store assistant helped me choose a pair that fit me well, and I walked around for a few minutes to make sure they were comfortable.</w:t>
       </w:r>
     </w:p>
     <w:p>
@@ -1938,7 +2215,357 @@
           <w:rFonts w:ascii="Arial" w:hAnsi="Arial" w:eastAsia="微软雅黑"/>
           <w:sz w:val="20"/>
         </w:rPr>
-        <w:t>• For example, I read several customer reviews before I buy electronics.</w:t>
+        <w:t>• Before paying, I compared the price and quality with another pair. This helped me avoid buying the wrong size and made me feel more confident about my choice.</w:t>
+      </w:r>
+    </w:p>
+    <w:p>
+      <w:pPr>
+        <w:pStyle w:val="4"/>
+        <w:spacing w:before="100" w:after="40"/>
+        <w:rPr>
+          <w:rFonts w:hint="default" w:eastAsia="微软雅黑"/>
+          <w:lang w:val="en-US" w:eastAsia="zh-CN"/>
+        </w:rPr>
+      </w:pPr>
+      <w:r>
+        <w:rPr>
+          <w:rFonts w:ascii="Arial" w:hAnsi="Arial" w:eastAsia="微软雅黑"/>
+        </w:rPr>
+        <w:t>14｜阅读：Novel电影 action movies</w:t>
+      </w:r>
+      <w:r>
+        <w:rPr>
+          <w:rFonts w:hint="eastAsia" w:ascii="Arial" w:hAnsi="Arial" w:eastAsia="微软雅黑"/>
+          <w:lang w:val="en-US" w:eastAsia="zh-CN"/>
+        </w:rPr>
+      </w:r>
+    </w:p>
+    <w:p>
+      <w:pPr>
+        <w:spacing w:after="0"/>
+        <w:ind w:left="173"/>
+        <w:rPr>
+          <w:rFonts w:hint="eastAsia" w:eastAsia="微软雅黑"/>
+          <w:sz w:val="20"/>
+          <w:lang w:val="en-US" w:eastAsia="zh-CN"/>
+        </w:rPr>
+      </w:pPr>
+      <w:r>
+        <w:rPr>
+          <w:rFonts w:ascii="Arial" w:hAnsi="Arial" w:eastAsia="微软雅黑"/>
+          <w:sz w:val="20"/>
+        </w:rPr>
+        <w:t xml:space="preserve">• I like reading novels in my free time. I usually read a few pages before </w:t>
+      </w:r>
+      <w:r>
+        <w:rPr>
+          <w:rFonts w:hint="eastAsia" w:eastAsia="微软雅黑"/>
+          <w:sz w:val="20"/>
+          <w:lang w:val="en-US" w:eastAsia="zh-CN"/>
+        </w:rPr>
+        <w:t>i go to sleep.i like the spideman most .xxxx.</w:t>
+      </w:r>
+      <w:r>
+        <w:rPr>
+          <w:rFonts w:ascii="Arial" w:hAnsi="Arial" w:eastAsia="微软雅黑"/>
+          <w:sz w:val="20"/>
+        </w:rPr>
+        <w:t>It helps me relax and clear my mind,</w:t>
+      </w:r>
+      <w:r>
+        <w:rPr>
+          <w:rFonts w:hint="eastAsia" w:eastAsia="微软雅黑"/>
+          <w:sz w:val="20"/>
+          <w:lang w:val="en-US" w:eastAsia="zh-CN"/>
+        </w:rPr>
+        <w:t>.xxxx.</w:t>
+      </w:r>
+    </w:p>
+    <w:p>
+      <w:pPr>
+        <w:spacing w:after="0"/>
+        <w:ind w:left="173"/>
+        <w:rPr>
+          <w:rFonts w:hint="eastAsia" w:eastAsia="微软雅黑"/>
+          <w:sz w:val="20"/>
+          <w:lang w:val="en-US" w:eastAsia="zh-CN"/>
+        </w:rPr>
+      </w:pPr>
+      <w:r>
+        <w:rPr>
+          <w:rFonts w:ascii="Arial" w:hAnsi="Arial" w:eastAsia="微软雅黑"/>
+          <w:sz w:val="20"/>
+        </w:rPr>
+        <w:t>•</w:t>
+      </w:r>
+      <w:r>
+        <w:rPr>
+          <w:rFonts w:hint="eastAsia" w:eastAsia="微软雅黑"/>
+          <w:sz w:val="20"/>
+          <w:lang w:val="en-US" w:eastAsia="zh-CN"/>
+        </w:rPr>
+        <w:t>his spirit encourages me a lot .for example,when i face some difficult problems.i understand the xxxx.</w:t>
+      </w:r>
+    </w:p>
+    <w:p>
+      <w:pPr>
+        <w:spacing w:after="0"/>
+        <w:ind w:left="173"/>
+        <w:rPr>
+          <w:rFonts w:hint="default" w:eastAsia="微软雅黑"/>
+          <w:sz w:val="20"/>
+          <w:lang w:val="en-US" w:eastAsia="zh-CN"/>
+        </w:rPr>
+      </w:pPr>
+    </w:p>
+    <w:p>
+      <w:pPr>
+        <w:pStyle w:val="4"/>
+        <w:spacing w:before="100" w:after="40"/>
+      </w:pPr>
+      <w:r>
+        <w:rPr>
+          <w:rFonts w:ascii="Arial" w:hAnsi="Arial" w:eastAsia="微软雅黑"/>
+        </w:rPr>
+        <w:t>15｜历史：长城</w:t>
+      </w:r>
+    </w:p>
+    <w:p>
+      <w:pPr>
+        <w:spacing w:after="0"/>
+        <w:ind w:left="173"/>
+        <w:rPr>
+          <w:rFonts w:hint="default" w:eastAsia="微软雅黑"/>
+          <w:lang w:val="en-US" w:eastAsia="zh-CN"/>
+        </w:rPr>
+      </w:pPr>
+      <w:r>
+        <w:rPr>
+          <w:rFonts w:ascii="Arial" w:hAnsi="Arial" w:eastAsia="微软雅黑"/>
+          <w:sz w:val="20"/>
+        </w:rPr>
+        <w:t xml:space="preserve">• I am interested in the Great Wall because it has a long history </w:t>
+      </w:r>
+      <w:r>
+        <w:rPr>
+          <w:rFonts w:hint="eastAsia" w:eastAsia="微软雅黑"/>
+          <w:sz w:val="20"/>
+          <w:lang w:val="en-US" w:eastAsia="zh-CN"/>
+        </w:rPr>
+        <w:t xml:space="preserve">.it </w:t>
+      </w:r>
+      <w:r>
+        <w:rPr>
+          <w:rFonts w:ascii="Arial" w:hAnsi="Arial" w:eastAsia="微软雅黑"/>
+          <w:sz w:val="20"/>
+        </w:rPr>
+        <w:t>is one of the most famous places in China. Its stone walls stretch across the mountains.</w:t>
+      </w:r>
+      <w:r>
+        <w:rPr>
+          <w:rFonts w:hint="eastAsia" w:eastAsia="微软雅黑"/>
+          <w:sz w:val="20"/>
+          <w:lang w:val="en-US" w:eastAsia="zh-CN"/>
+        </w:rPr>
+        <w:t>in the past,china was invaded by others.xxxx</w:t>
+      </w:r>
+    </w:p>
+    <w:p>
+      <w:pPr>
+        <w:spacing w:after="0"/>
+        <w:ind w:left="173"/>
+        <w:rPr>
+          <w:rFonts w:hint="default" w:eastAsia="微软雅黑"/>
+          <w:lang w:val="en-US" w:eastAsia="zh-CN"/>
+        </w:rPr>
+      </w:pPr>
+      <w:r>
+        <w:rPr>
+          <w:rFonts w:ascii="Arial" w:hAnsi="Arial" w:eastAsia="微软雅黑"/>
+          <w:sz w:val="20"/>
+        </w:rPr>
+        <w:t xml:space="preserve">• </w:t>
+      </w:r>
+      <w:r>
+        <w:rPr>
+          <w:rFonts w:hint="eastAsia" w:eastAsia="微软雅黑"/>
+          <w:sz w:val="20"/>
+          <w:lang w:val="en-US" w:eastAsia="zh-CN"/>
+        </w:rPr>
+        <w:t xml:space="preserve">it </w:t>
+      </w:r>
+      <w:r>
+        <w:rPr>
+          <w:rFonts w:ascii="Arial" w:hAnsi="Arial" w:eastAsia="微软雅黑"/>
+          <w:sz w:val="20"/>
+        </w:rPr>
+        <w:t>give</w:t>
+      </w:r>
+      <w:r>
+        <w:rPr>
+          <w:rFonts w:hint="eastAsia" w:eastAsia="微软雅黑"/>
+          <w:sz w:val="20"/>
+          <w:lang w:val="en-US" w:eastAsia="zh-CN"/>
+        </w:rPr>
+        <w:t>s</w:t>
+      </w:r>
+      <w:r>
+        <w:rPr>
+          <w:rFonts w:ascii="Arial" w:hAnsi="Arial" w:eastAsia="微软雅黑"/>
+          <w:sz w:val="20"/>
+        </w:rPr>
+        <w:t xml:space="preserve"> me a chance to learn more about Chinese history and </w:t>
+      </w:r>
+      <w:r>
+        <w:rPr>
+          <w:rFonts w:hint="eastAsia" w:eastAsia="微软雅黑"/>
+          <w:sz w:val="20"/>
+          <w:lang w:val="en-US" w:eastAsia="zh-CN"/>
+        </w:rPr>
+        <w:t>meet a lot of friends</w:t>
+      </w:r>
+      <w:r>
+        <w:rPr>
+          <w:rFonts w:ascii="Arial" w:hAnsi="Arial" w:eastAsia="微软雅黑"/>
+          <w:sz w:val="20"/>
+        </w:rPr>
+        <w:t>.</w:t>
+      </w:r>
+      <w:r>
+        <w:rPr>
+          <w:rFonts w:hint="eastAsia" w:eastAsia="微软雅黑"/>
+          <w:sz w:val="20"/>
+          <w:lang w:val="en-US" w:eastAsia="zh-CN"/>
+        </w:rPr>
+        <w:t>xxxx</w:t>
+      </w:r>
+    </w:p>
+    <w:p>
+      <w:pPr>
+        <w:pStyle w:val="4"/>
+        <w:spacing w:before="100" w:after="40"/>
+      </w:pPr>
+      <w:r>
+        <w:rPr>
+          <w:rFonts w:ascii="Arial" w:hAnsi="Arial" w:eastAsia="微软雅黑"/>
+        </w:rPr>
+        <w:t>16｜志愿活动：图书馆</w:t>
+      </w:r>
+    </w:p>
+    <w:p>
+      <w:pPr>
+        <w:spacing w:after="0"/>
+        <w:ind w:left="173"/>
+        <w:rPr>
+          <w:rFonts w:hint="default" w:eastAsia="微软雅黑"/>
+          <w:lang w:val="en-US" w:eastAsia="zh-CN"/>
+        </w:rPr>
+      </w:pPr>
+      <w:r>
+        <w:rPr>
+          <w:rFonts w:ascii="Arial" w:hAnsi="Arial" w:eastAsia="微软雅黑"/>
+          <w:sz w:val="20"/>
+        </w:rPr>
+        <w:t xml:space="preserve">• I once volunteered at </w:t>
+      </w:r>
+      <w:r>
+        <w:rPr>
+          <w:rFonts w:hint="eastAsia" w:eastAsia="微软雅黑"/>
+          <w:sz w:val="20"/>
+          <w:lang w:val="en-US" w:eastAsia="zh-CN"/>
+        </w:rPr>
+        <w:t>school</w:t>
+      </w:r>
+      <w:r>
+        <w:rPr>
+          <w:rFonts w:ascii="Arial" w:hAnsi="Arial" w:eastAsia="微软雅黑"/>
+          <w:sz w:val="20"/>
+        </w:rPr>
+        <w:t xml:space="preserve"> library. I helped organize books and showed visitors where to find the </w:t>
+      </w:r>
+      <w:r>
+        <w:rPr>
+          <w:rFonts w:hint="eastAsia" w:eastAsia="微软雅黑"/>
+          <w:sz w:val="20"/>
+          <w:lang w:val="en-US" w:eastAsia="zh-CN"/>
+        </w:rPr>
+        <w:t xml:space="preserve">books </w:t>
+      </w:r>
+      <w:r>
+        <w:rPr>
+          <w:rFonts w:ascii="Arial" w:hAnsi="Arial" w:eastAsia="微软雅黑"/>
+          <w:sz w:val="20"/>
+        </w:rPr>
+        <w:t>they needed.</w:t>
+      </w:r>
+      <w:r>
+        <w:rPr>
+          <w:rFonts w:hint="eastAsia" w:eastAsia="微软雅黑"/>
+          <w:sz w:val="20"/>
+          <w:lang w:val="en-US" w:eastAsia="zh-CN"/>
+        </w:rPr>
+        <w:t>communication skills</w:t>
+      </w:r>
+    </w:p>
+    <w:p>
+      <w:pPr>
+        <w:spacing w:after="0"/>
+        <w:ind w:left="173"/>
+        <w:rPr>
+          <w:rFonts w:hint="default" w:eastAsia="微软雅黑"/>
+          <w:lang w:val="en-US" w:eastAsia="zh-CN"/>
+        </w:rPr>
+      </w:pPr>
+      <w:r>
+        <w:rPr>
+          <w:rFonts w:ascii="Arial" w:hAnsi="Arial" w:eastAsia="微软雅黑"/>
+          <w:sz w:val="20"/>
+        </w:rPr>
+        <w:t xml:space="preserve">• Since I like reading, I enjoyed being surrounded by books and helping a student find </w:t>
+      </w:r>
+      <w:r>
+        <w:rPr>
+          <w:rFonts w:hint="eastAsia" w:eastAsia="微软雅黑"/>
+          <w:sz w:val="20"/>
+          <w:lang w:val="en-US" w:eastAsia="zh-CN"/>
+        </w:rPr>
+        <w:t>what he needed</w:t>
+      </w:r>
+      <w:r>
+        <w:rPr>
+          <w:rFonts w:ascii="Arial" w:hAnsi="Arial" w:eastAsia="微软雅黑"/>
+          <w:sz w:val="20"/>
+        </w:rPr>
+        <w:t>. This gave me a chanc</w:t>
+      </w:r>
+      <w:bookmarkStart w:id="0" w:name="_GoBack"/>
+      <w:bookmarkEnd w:id="0"/>
+      <w:r>
+        <w:rPr>
+          <w:rFonts w:ascii="Arial" w:hAnsi="Arial" w:eastAsia="微软雅黑"/>
+          <w:sz w:val="20"/>
+        </w:rPr>
+        <w:t>e to help other people and made me more confident when talking to strangers.</w:t>
+      </w:r>
+      <w:r>
+        <w:rPr>
+          <w:rFonts w:hint="eastAsia" w:eastAsia="微软雅黑"/>
+          <w:sz w:val="20"/>
+          <w:lang w:val="en-US" w:eastAsia="zh-CN"/>
+        </w:rPr>
+        <w:t>open-mindedxxxx</w:t>
+      </w:r>
+    </w:p>
+    <w:p>
+      <w:pPr>
+        <w:pStyle w:val="4"/>
+        <w:spacing w:before="100" w:after="40"/>
+      </w:pPr>
+      <w:r>
+        <w:rPr>
+          <w:rFonts w:ascii="Arial" w:hAnsi="Arial" w:eastAsia="微软雅黑"/>
+        </w:rPr>
+        <w:t>17｜节日：传统美食</w:t>
       </w:r>
     </w:p>
     <w:p>
@@ -1951,7 +2578,37 @@
           <w:rFonts w:ascii="Arial" w:hAnsi="Arial" w:eastAsia="微软雅黑"/>
           <w:sz w:val="20"/>
         </w:rPr>
-        <w:t>• This helps me choose what I actually need and avoid unnecessary spending.</w:t>
+        <w:t>• I enjoy festivals that involve traditional food. During the</w:t>
+      </w:r>
+      <w:r>
+        <w:rPr>
+          <w:rFonts w:hint="eastAsia" w:eastAsia="微软雅黑"/>
+          <w:sz w:val="20"/>
+          <w:lang w:val="en-US" w:eastAsia="zh-CN"/>
+        </w:rPr>
+        <w:t xml:space="preserve"> Food</w:t>
+      </w:r>
+      <w:r>
+        <w:rPr>
+          <w:rFonts w:ascii="Arial" w:hAnsi="Arial" w:eastAsia="微软雅黑"/>
+          <w:sz w:val="20"/>
+        </w:rPr>
+        <w:t xml:space="preserve"> Festival, my family makes dumplings and prepares several </w:t>
+      </w:r>
+      <w:r>
+        <w:rPr>
+          <w:rFonts w:hint="eastAsia" w:eastAsia="微软雅黑"/>
+          <w:sz w:val="20"/>
+          <w:lang w:val="en-US" w:eastAsia="zh-CN"/>
+        </w:rPr>
+        <w:t xml:space="preserve">dicilious dishes </w:t>
+      </w:r>
+      <w:r>
+        <w:rPr>
+          <w:rFonts w:ascii="Arial" w:hAnsi="Arial" w:eastAsia="微软雅黑"/>
+          <w:sz w:val="20"/>
+        </w:rPr>
+        <w:t>together.</w:t>
       </w:r>
     </w:p>
     <w:p>
@@ -1964,7 +2621,7 @@
           <w:rFonts w:ascii="Arial" w:hAnsi="Arial" w:eastAsia="微软雅黑"/>
           <w:sz w:val="20"/>
         </w:rPr>
-        <w:t>• As a result, I can shop more efficiently and stay within my budget.</w:t>
+        <w:t>• We eat together at home and talk without checking our phones. This gives us a good chance to spend quality time together and brings us closer.</w:t>
       </w:r>
     </w:p>
     <w:p>
@@ -1976,7 +2633,47 @@
         <w:rPr>
           <w:rFonts w:ascii="Arial" w:hAnsi="Arial" w:eastAsia="微软雅黑"/>
         </w:rPr>
-        <w:t>11｜线下购物：买鞋</w:t>
+        <w:t>18｜音乐：Classical music</w:t>
+      </w:r>
+    </w:p>
+    <w:p>
+      <w:pPr>
+        <w:spacing w:after="0"/>
+        <w:ind w:left="173"/>
+        <w:rPr>
+          <w:rFonts w:hint="default" w:eastAsia="微软雅黑"/>
+          <w:lang w:val="en-US" w:eastAsia="zh-CN"/>
+        </w:rPr>
+      </w:pPr>
+      <w:r>
+        <w:rPr>
+          <w:rFonts w:ascii="Arial" w:hAnsi="Arial" w:eastAsia="微软雅黑"/>
+          <w:sz w:val="20"/>
+        </w:rPr>
+        <w:t xml:space="preserve">• I like listening to classical music in my free time. I often listen to a short piano piece while I </w:t>
+      </w:r>
+      <w:r>
+        <w:rPr>
+          <w:rFonts w:hint="eastAsia" w:eastAsia="微软雅黑"/>
+          <w:sz w:val="20"/>
+          <w:lang w:val="en-US" w:eastAsia="zh-CN"/>
+        </w:rPr>
+        <w:t>am studying</w:t>
+      </w:r>
+      <w:r>
+        <w:rPr>
+          <w:rFonts w:ascii="Arial" w:hAnsi="Arial" w:eastAsia="微软雅黑"/>
+          <w:sz w:val="20"/>
+        </w:rPr>
+        <w:t>.</w:t>
+      </w:r>
+      <w:r>
+        <w:rPr>
+          <w:rFonts w:hint="eastAsia" w:eastAsia="微软雅黑"/>
+          <w:sz w:val="20"/>
+          <w:lang w:val="en-US" w:eastAsia="zh-CN"/>
+        </w:rPr>
+        <w:t xml:space="preserve"> concentrate</w:t>
       </w:r>
     </w:p>
     <w:p>
@@ -1989,444 +2686,22 @@
           <w:rFonts w:ascii="Arial" w:hAnsi="Arial" w:eastAsia="微软雅黑"/>
           <w:sz w:val="20"/>
         </w:rPr>
-        <w:t>• I once bought a pair of shoes in a physical store.</w:t>
+        <w:t>• Before bed, I sometimes listen to quiet music</w:t>
       </w:r>
-    </w:p>
-    <w:p>
-      <w:pPr>
-        <w:spacing w:after="0"/>
-        <w:ind w:left="173"/>
-      </w:pPr>
+      <w:r>
+        <w:rPr>
+          <w:rFonts w:hint="eastAsia" w:eastAsia="微软雅黑"/>
+          <w:sz w:val="20"/>
+          <w:lang w:val="en-US" w:eastAsia="zh-CN"/>
+        </w:rPr>
+        <w:t>.</w:t>
+      </w:r>
       <w:r>
         <w:rPr>
           <w:rFonts w:ascii="Arial" w:hAnsi="Arial" w:eastAsia="微软雅黑"/>
           <w:sz w:val="20"/>
         </w:rPr>
-        <w:t>• The store assistant helped me choose a pair that fit me well, and I could try them on before paying.</w:t>
-      </w:r>
-    </w:p>
-    <w:p>
-      <w:pPr>
-        <w:spacing w:after="0"/>
-        <w:ind w:left="173"/>
-      </w:pPr>
-      <w:r>
-        <w:rPr>
-          <w:rFonts w:ascii="Arial" w:hAnsi="Arial" w:eastAsia="微软雅黑"/>
-          <w:sz w:val="20"/>
-        </w:rPr>
-        <w:t>• I walked around the store for a few minutes to make sure they were comfortable.</w:t>
-      </w:r>
-    </w:p>
-    <w:p>
-      <w:pPr>
-        <w:spacing w:after="0"/>
-        <w:ind w:left="173"/>
-      </w:pPr>
-      <w:r>
-        <w:rPr>
-          <w:rFonts w:ascii="Arial" w:hAnsi="Arial" w:eastAsia="微软雅黑"/>
-          <w:sz w:val="20"/>
-        </w:rPr>
-        <w:t>• That made the shopping experience easy and helped me avoid buying the wrong size.</w:t>
-      </w:r>
-    </w:p>
-    <w:p>
-      <w:pPr>
-        <w:spacing w:after="0"/>
-        <w:ind w:left="173"/>
-      </w:pPr>
-      <w:r>
-        <w:rPr>
-          <w:rFonts w:ascii="Arial" w:hAnsi="Arial" w:eastAsia="微软雅黑"/>
-          <w:sz w:val="20"/>
-        </w:rPr>
-        <w:t>• As a result, I felt more confident about my choice.</w:t>
-      </w:r>
-    </w:p>
-    <w:p>
-      <w:pPr>
-        <w:pStyle w:val="4"/>
-        <w:spacing w:before="100" w:after="40"/>
-      </w:pPr>
-      <w:r>
-        <w:rPr>
-          <w:rFonts w:ascii="Arial" w:hAnsi="Arial" w:eastAsia="微软雅黑"/>
-        </w:rPr>
-        <w:t>12｜阅读：Novel</w:t>
-      </w:r>
-    </w:p>
-    <w:p>
-      <w:pPr>
-        <w:spacing w:after="0"/>
-        <w:ind w:left="173"/>
-      </w:pPr>
-      <w:r>
-        <w:rPr>
-          <w:rFonts w:ascii="Arial" w:hAnsi="Arial" w:eastAsia="微软雅黑"/>
-          <w:sz w:val="20"/>
-        </w:rPr>
-        <w:t>• I like reading novels in my free time.</w:t>
-      </w:r>
-    </w:p>
-    <w:p>
-      <w:pPr>
-        <w:spacing w:after="0"/>
-        <w:ind w:left="173"/>
-      </w:pPr>
-      <w:r>
-        <w:rPr>
-          <w:rFonts w:ascii="Arial" w:hAnsi="Arial" w:eastAsia="微软雅黑"/>
-          <w:sz w:val="20"/>
-        </w:rPr>
-        <w:t>• I usually read a few pages before bed when the room is quiet.</w:t>
-      </w:r>
-    </w:p>
-    <w:p>
-      <w:pPr>
-        <w:spacing w:after="0"/>
-        <w:ind w:left="173"/>
-      </w:pPr>
-      <w:r>
-        <w:rPr>
-          <w:rFonts w:ascii="Arial" w:hAnsi="Arial" w:eastAsia="微软雅黑"/>
-          <w:sz w:val="20"/>
-        </w:rPr>
-        <w:t>• I enjoy stories with well-written characters because I can imagine myself in their situation.</w:t>
-      </w:r>
-    </w:p>
-    <w:p>
-      <w:pPr>
-        <w:spacing w:after="0"/>
-        <w:ind w:left="173"/>
-      </w:pPr>
-      <w:r>
-        <w:rPr>
-          <w:rFonts w:ascii="Arial" w:hAnsi="Arial" w:eastAsia="微软雅黑"/>
-          <w:sz w:val="20"/>
-        </w:rPr>
-        <w:t>• This helps me relax, clear my mind, and forget about stress for a while.</w:t>
-      </w:r>
-    </w:p>
-    <w:p>
-      <w:pPr>
-        <w:spacing w:after="0"/>
-        <w:ind w:left="173"/>
-      </w:pPr>
-      <w:r>
-        <w:rPr>
-          <w:rFonts w:ascii="Arial" w:hAnsi="Arial" w:eastAsia="微软雅黑"/>
-          <w:sz w:val="20"/>
-        </w:rPr>
-        <w:t>• It also gives me a chance to see the world from different perspectives.</w:t>
-      </w:r>
-    </w:p>
-    <w:p>
-      <w:pPr>
-        <w:pStyle w:val="4"/>
-        <w:spacing w:before="100" w:after="40"/>
-      </w:pPr>
-      <w:r>
-        <w:rPr>
-          <w:rFonts w:ascii="Arial" w:hAnsi="Arial" w:eastAsia="微软雅黑"/>
-        </w:rPr>
-        <w:t>13｜历史：长城</w:t>
-      </w:r>
-    </w:p>
-    <w:p>
-      <w:pPr>
-        <w:spacing w:after="0"/>
-        <w:ind w:left="173"/>
-      </w:pPr>
-      <w:r>
-        <w:rPr>
-          <w:rFonts w:ascii="Arial" w:hAnsi="Arial" w:eastAsia="微软雅黑"/>
-          <w:sz w:val="20"/>
-        </w:rPr>
-        <w:t>• I am interested in the Great Wall.</w:t>
-      </w:r>
-    </w:p>
-    <w:p>
-      <w:pPr>
-        <w:spacing w:after="0"/>
-        <w:ind w:left="173"/>
-      </w:pPr>
-      <w:r>
-        <w:rPr>
-          <w:rFonts w:ascii="Arial" w:hAnsi="Arial" w:eastAsia="微软雅黑"/>
-          <w:sz w:val="20"/>
-        </w:rPr>
-        <w:t>• It has a long history and is one of the most famous historical places in China.</w:t>
-      </w:r>
-    </w:p>
-    <w:p>
-      <w:pPr>
-        <w:spacing w:after="0"/>
-        <w:ind w:left="173"/>
-      </w:pPr>
-      <w:r>
-        <w:rPr>
-          <w:rFonts w:ascii="Arial" w:hAnsi="Arial" w:eastAsia="微软雅黑"/>
-          <w:sz w:val="20"/>
-        </w:rPr>
-        <w:t>• Its long stone walls and watchtowers stretch across the mountains.</w:t>
-      </w:r>
-    </w:p>
-    <w:p>
-      <w:pPr>
-        <w:spacing w:after="0"/>
-        <w:ind w:left="173"/>
-      </w:pPr>
-      <w:r>
-        <w:rPr>
-          <w:rFonts w:ascii="Arial" w:hAnsi="Arial" w:eastAsia="微软雅黑"/>
-          <w:sz w:val="20"/>
-        </w:rPr>
-        <w:t>• Learning about it gives me a chance to understand more about Chinese history and culture.</w:t>
-      </w:r>
-    </w:p>
-    <w:p>
-      <w:pPr>
-        <w:spacing w:after="0"/>
-        <w:ind w:left="173"/>
-      </w:pPr>
-      <w:r>
-        <w:rPr>
-          <w:rFonts w:ascii="Arial" w:hAnsi="Arial" w:eastAsia="微软雅黑"/>
-          <w:sz w:val="20"/>
-        </w:rPr>
-        <w:t>• It also gives me a chance to learn how people lived in the past.</w:t>
-      </w:r>
-    </w:p>
-    <w:p>
-      <w:pPr>
-        <w:pStyle w:val="4"/>
-        <w:spacing w:before="100" w:after="40"/>
-      </w:pPr>
-      <w:r>
-        <w:rPr>
-          <w:rFonts w:ascii="Arial" w:hAnsi="Arial" w:eastAsia="微软雅黑"/>
-        </w:rPr>
-        <w:t>14｜志愿活动：图书馆</w:t>
-      </w:r>
-    </w:p>
-    <w:p>
-      <w:pPr>
-        <w:spacing w:after="0"/>
-        <w:ind w:left="173"/>
-      </w:pPr>
-      <w:r>
-        <w:rPr>
-          <w:rFonts w:ascii="Arial" w:hAnsi="Arial" w:eastAsia="微软雅黑"/>
-          <w:sz w:val="20"/>
-        </w:rPr>
-        <w:t>• I once volunteered at a local library.</w:t>
-      </w:r>
-    </w:p>
-    <w:p>
-      <w:pPr>
-        <w:spacing w:after="0"/>
-        <w:ind w:left="173"/>
-      </w:pPr>
-      <w:r>
-        <w:rPr>
-          <w:rFonts w:ascii="Arial" w:hAnsi="Arial" w:eastAsia="微软雅黑"/>
-          <w:sz w:val="20"/>
-        </w:rPr>
-        <w:t>• I helped organize books and showed visitors where to find the information they needed.</w:t>
-      </w:r>
-    </w:p>
-    <w:p>
-      <w:pPr>
-        <w:spacing w:after="0"/>
-        <w:ind w:left="173"/>
-      </w:pPr>
-      <w:r>
-        <w:rPr>
-          <w:rFonts w:ascii="Arial" w:hAnsi="Arial" w:eastAsia="微软雅黑"/>
-          <w:sz w:val="20"/>
-        </w:rPr>
-        <w:t>• One afternoon, I helped a student find a history book for a school project.</w:t>
-      </w:r>
-    </w:p>
-    <w:p>
-      <w:pPr>
-        <w:spacing w:after="0"/>
-        <w:ind w:left="173"/>
-      </w:pPr>
-      <w:r>
-        <w:rPr>
-          <w:rFonts w:ascii="Arial" w:hAnsi="Arial" w:eastAsia="微软雅黑"/>
-          <w:sz w:val="20"/>
-        </w:rPr>
-        <w:t>• The experience improved my communication skills and gave me a chance to help other people.</w:t>
-      </w:r>
-    </w:p>
-    <w:p>
-      <w:pPr>
-        <w:spacing w:after="0"/>
-        <w:ind w:left="173"/>
-      </w:pPr>
-      <w:r>
-        <w:rPr>
-          <w:rFonts w:ascii="Arial" w:hAnsi="Arial" w:eastAsia="微软雅黑"/>
-          <w:sz w:val="20"/>
-        </w:rPr>
-        <w:t>• As a result, I became more confident when talking to strangers.</w:t>
-      </w:r>
-    </w:p>
-    <w:p>
-      <w:pPr>
-        <w:pStyle w:val="4"/>
-        <w:spacing w:before="100" w:after="40"/>
-      </w:pPr>
-      <w:r>
-        <w:rPr>
-          <w:rFonts w:ascii="Arial" w:hAnsi="Arial" w:eastAsia="微软雅黑"/>
-        </w:rPr>
-        <w:t>15｜节日：传统美食</w:t>
-      </w:r>
-    </w:p>
-    <w:p>
-      <w:pPr>
-        <w:spacing w:after="0"/>
-        <w:ind w:left="173"/>
-      </w:pPr>
-      <w:r>
-        <w:rPr>
-          <w:rFonts w:ascii="Arial" w:hAnsi="Arial" w:eastAsia="微软雅黑"/>
-          <w:sz w:val="20"/>
-        </w:rPr>
-        <w:t>• I enjoy festivals that involve traditional food.</w:t>
-      </w:r>
-    </w:p>
-    <w:p>
-      <w:pPr>
-        <w:spacing w:after="0"/>
-        <w:ind w:left="173"/>
-      </w:pPr>
-      <w:r>
-        <w:rPr>
-          <w:rFonts w:ascii="Arial" w:hAnsi="Arial" w:eastAsia="微软雅黑"/>
-          <w:sz w:val="20"/>
-        </w:rPr>
-        <w:t>• My family usually prepares several special dishes, and we eat together at home.</w:t>
-      </w:r>
-    </w:p>
-    <w:p>
-      <w:pPr>
-        <w:spacing w:after="0"/>
-        <w:ind w:left="173"/>
-      </w:pPr>
-      <w:r>
-        <w:rPr>
-          <w:rFonts w:ascii="Arial" w:hAnsi="Arial" w:eastAsia="微软雅黑"/>
-          <w:sz w:val="20"/>
-        </w:rPr>
-        <w:t>• For example, during the Spring Festival, we make dumplings together.</w:t>
-      </w:r>
-    </w:p>
-    <w:p>
-      <w:pPr>
-        <w:spacing w:after="0"/>
-        <w:ind w:left="173"/>
-      </w:pPr>
-      <w:r>
-        <w:rPr>
-          <w:rFonts w:ascii="Arial" w:hAnsi="Arial" w:eastAsia="微软雅黑"/>
-          <w:sz w:val="20"/>
-        </w:rPr>
-        <w:t>• It gives us a good chance to spend quality time together and brings us closer.</w:t>
-      </w:r>
-    </w:p>
-    <w:p>
-      <w:pPr>
-        <w:spacing w:after="0"/>
-        <w:ind w:left="173"/>
-      </w:pPr>
-      <w:r>
-        <w:rPr>
-          <w:rFonts w:ascii="Arial" w:hAnsi="Arial" w:eastAsia="微软雅黑"/>
-          <w:sz w:val="20"/>
-        </w:rPr>
-        <w:t>• It also helps me understand and appreciate my family traditions.</w:t>
-      </w:r>
-    </w:p>
-    <w:p>
-      <w:pPr>
-        <w:pStyle w:val="4"/>
-        <w:spacing w:before="100" w:after="40"/>
-      </w:pPr>
-      <w:r>
-        <w:rPr>
-          <w:rFonts w:ascii="Arial" w:hAnsi="Arial" w:eastAsia="微软雅黑"/>
-        </w:rPr>
-        <w:t>16｜音乐：Classical music</w:t>
-      </w:r>
-    </w:p>
-    <w:p>
-      <w:pPr>
-        <w:spacing w:after="0"/>
-        <w:ind w:left="173"/>
-      </w:pPr>
-      <w:r>
-        <w:rPr>
-          <w:rFonts w:ascii="Arial" w:hAnsi="Arial" w:eastAsia="微软雅黑"/>
-          <w:sz w:val="20"/>
-        </w:rPr>
-        <w:t>• I like listening to classical music in my free time.</w:t>
-      </w:r>
-    </w:p>
-    <w:p>
-      <w:pPr>
-        <w:spacing w:after="0"/>
-        <w:ind w:left="173"/>
-      </w:pPr>
-      <w:r>
-        <w:rPr>
-          <w:rFonts w:ascii="Arial" w:hAnsi="Arial" w:eastAsia="微软雅黑"/>
-          <w:sz w:val="20"/>
-        </w:rPr>
-        <w:t>• I often listen to a short piano piece while I review my notes.</w:t>
-      </w:r>
-    </w:p>
-    <w:p>
-      <w:pPr>
-        <w:spacing w:after="0"/>
-        <w:ind w:left="173"/>
-      </w:pPr>
-      <w:r>
-        <w:rPr>
-          <w:rFonts w:ascii="Arial" w:hAnsi="Arial" w:eastAsia="微软雅黑"/>
-          <w:sz w:val="20"/>
-        </w:rPr>
-        <w:t>• The music is calm, and I can imagine different scenes while I listen to it.</w:t>
-      </w:r>
-    </w:p>
-    <w:p>
-      <w:pPr>
-        <w:spacing w:after="0"/>
-        <w:ind w:left="173"/>
-      </w:pPr>
-      <w:r>
-        <w:rPr>
-          <w:rFonts w:ascii="Arial" w:hAnsi="Arial" w:eastAsia="微软雅黑"/>
-          <w:sz w:val="20"/>
-        </w:rPr>
-        <w:t>• This helps me relax, clear my mind, and forget about stress for a while.</w:t>
-      </w:r>
-    </w:p>
-    <w:p>
-      <w:pPr>
-        <w:spacing w:after="0"/>
-        <w:ind w:left="173"/>
-      </w:pPr>
-      <w:r>
-        <w:rPr>
-          <w:rFonts w:ascii="Arial" w:hAnsi="Arial" w:eastAsia="微软雅黑"/>
-          <w:sz w:val="20"/>
-        </w:rPr>
-        <w:t>• It also helps me stay focused when I study or work.</w:t>
+        <w:t xml:space="preserve"> because it helps me relax and clear my mind. It also makes it easier for me to fall asleep.</w:t>
       </w:r>
     </w:p>
     <w:p/>
@@ -3454,14 +3729,14 @@
     <w:lsdException w:qFormat="1" w:uiPriority="99" w:semiHidden="0" w:name="List Bullet 3"/>
     <w:lsdException w:uiPriority="99" w:name="List Bullet 4"/>
     <w:lsdException w:uiPriority="99" w:name="List Bullet 5"/>
-    <w:lsdException w:uiPriority="99" w:semiHidden="0" w:name="List Number 2"/>
+    <w:lsdException w:qFormat="1" w:uiPriority="99" w:semiHidden="0" w:name="List Number 2"/>
     <w:lsdException w:qFormat="1" w:uiPriority="99" w:semiHidden="0" w:name="List Number 3"/>
     <w:lsdException w:uiPriority="99" w:name="List Number 4"/>
     <w:lsdException w:uiPriority="99" w:name="List Number 5"/>
     <w:lsdException w:qFormat="1" w:unhideWhenUsed="0" w:uiPriority="10" w:semiHidden="0" w:name="Title"/>
     <w:lsdException w:uiPriority="99" w:name="Closing"/>
     <w:lsdException w:uiPriority="99" w:name="Signature"/>
-    <w:lsdException w:uiPriority="1" w:name="Default Paragraph Font"/>
+    <w:lsdException w:qFormat="1" w:uiPriority="1" w:name="Default Paragraph Font"/>
     <w:lsdException w:qFormat="1" w:uiPriority="99" w:semiHidden="0" w:name="Body Text"/>
     <w:lsdException w:uiPriority="99" w:name="Body Text Indent"/>
     <w:lsdException w:qFormat="1" w:uiPriority="99" w:semiHidden="0" w:name="List Continue"/>
@@ -3548,15 +3823,15 @@
     <w:lsdException w:uiPriority="99" w:name="Table Theme"/>
     <w:lsdException w:qFormat="1" w:unhideWhenUsed="0" w:uiPriority="1" w:semiHidden="0" w:name="No Spacing"/>
     <w:lsdException w:qFormat="1" w:unhideWhenUsed="0" w:uiPriority="60" w:semiHidden="0" w:name="Light Shading"/>
-    <w:lsdException w:unhideWhenUsed="0" w:uiPriority="61" w:semiHidden="0" w:name="Light List"/>
-    <w:lsdException w:unhideWhenUsed="0" w:uiPriority="62" w:semiHidden="0" w:name="Light Grid"/>
-    <w:lsdException w:unhideWhenUsed="0" w:uiPriority="63" w:semiHidden="0" w:name="Medium Shading 1"/>
+    <w:lsdException w:qFormat="1" w:unhideWhenUsed="0" w:uiPriority="61" w:semiHidden="0" w:name="Light List"/>
+    <w:lsdException w:qFormat="1" w:unhideWhenUsed="0" w:uiPriority="62" w:semiHidden="0" w:name="Light Grid"/>
+    <w:lsdException w:qFormat="1" w:unhideWhenUsed="0" w:uiPriority="63" w:semiHidden="0" w:name="Medium Shading 1"/>
     <w:lsdException w:qFormat="1" w:unhideWhenUsed="0" w:uiPriority="64" w:semiHidden="0" w:name="Medium Shading 2"/>
-    <w:lsdException w:unhideWhenUsed="0" w:uiPriority="65" w:semiHidden="0" w:name="Medium List 1"/>
+    <w:lsdException w:qFormat="1" w:unhideWhenUsed="0" w:uiPriority="65" w:semiHidden="0" w:name="Medium List 1"/>
     <w:lsdException w:qFormat="1" w:unhideWhenUsed="0" w:uiPriority="66" w:semiHidden="0" w:name="Medium List 2"/>
     <w:lsdException w:qFormat="1" w:unhideWhenUsed="0" w:uiPriority="67" w:semiHidden="0" w:name="Medium Grid 1"/>
-    <w:lsdException w:unhideWhenUsed="0" w:uiPriority="68" w:semiHidden="0" w:name="Medium Grid 2"/>
-    <w:lsdException w:unhideWhenUsed="0" w:uiPriority="69" w:semiHidden="0" w:name="Medium Grid 3"/>
+    <w:lsdException w:qFormat="1" w:unhideWhenUsed="0" w:uiPriority="68" w:semiHidden="0" w:name="Medium Grid 2"/>
+    <w:lsdException w:qFormat="1" w:unhideWhenUsed="0" w:uiPriority="69" w:semiHidden="0" w:name="Medium Grid 3"/>
     <w:lsdException w:unhideWhenUsed="0" w:uiPriority="70" w:semiHidden="0" w:name="Dark List"/>
     <w:lsdException w:unhideWhenUsed="0" w:uiPriority="71" w:semiHidden="0" w:name="Colorful Shading"/>
     <w:lsdException w:unhideWhenUsed="0" w:uiPriority="72" w:semiHidden="0" w:name="Colorful List"/>
@@ -3564,15 +3839,15 @@
     <w:lsdException w:qFormat="1" w:unhideWhenUsed="0" w:uiPriority="60" w:semiHidden="0" w:name="Light Shading Accent 1"/>
     <w:lsdException w:qFormat="1" w:unhideWhenUsed="0" w:uiPriority="61" w:semiHidden="0" w:name="Light List Accent 1"/>
     <w:lsdException w:qFormat="1" w:unhideWhenUsed="0" w:uiPriority="62" w:semiHidden="0" w:name="Light Grid Accent 1"/>
-    <w:lsdException w:unhideWhenUsed="0" w:uiPriority="63" w:semiHidden="0" w:name="Medium Shading 1 Accent 1"/>
+    <w:lsdException w:qFormat="1" w:unhideWhenUsed="0" w:uiPriority="63" w:semiHidden="0" w:name="Medium Shading 1 Accent 1"/>
     <w:lsdException w:qFormat="1" w:unhideWhenUsed="0" w:uiPriority="64" w:semiHidden="0" w:name="Medium Shading 2 Accent 1"/>
     <w:lsdException w:qFormat="1" w:unhideWhenUsed="0" w:uiPriority="65" w:semiHidden="0" w:name="Medium List 1 Accent 1"/>
     <w:lsdException w:qFormat="1" w:unhideWhenUsed="0" w:uiPriority="34" w:semiHidden="0" w:name="List Paragraph"/>
     <w:lsdException w:qFormat="1" w:unhideWhenUsed="0" w:uiPriority="29" w:semiHidden="0" w:name="Quote"/>
     <w:lsdException w:qFormat="1" w:unhideWhenUsed="0" w:uiPriority="30" w:semiHidden="0" w:name="Intense Quote"/>
-    <w:lsdException w:unhideWhenUsed="0" w:uiPriority="66" w:semiHidden="0" w:name="Medium List 2 Accent 1"/>
-    <w:lsdException w:unhideWhenUsed="0" w:uiPriority="67" w:semiHidden="0" w:name="Medium Grid 1 Accent 1"/>
-    <w:lsdException w:unhideWhenUsed="0" w:uiPriority="68" w:semiHidden="0" w:name="Medium Grid 2 Accent 1"/>
+    <w:lsdException w:qFormat="1" w:unhideWhenUsed="0" w:uiPriority="66" w:semiHidden="0" w:name="Medium List 2 Accent 1"/>
+    <w:lsdException w:qFormat="1" w:unhideWhenUsed="0" w:uiPriority="67" w:semiHidden="0" w:name="Medium Grid 1 Accent 1"/>
+    <w:lsdException w:qFormat="1" w:unhideWhenUsed="0" w:uiPriority="68" w:semiHidden="0" w:name="Medium Grid 2 Accent 1"/>
     <w:lsdException w:qFormat="1" w:unhideWhenUsed="0" w:uiPriority="69" w:semiHidden="0" w:name="Medium Grid 3 Accent 1"/>
     <w:lsdException w:qFormat="1" w:unhideWhenUsed="0" w:uiPriority="70" w:semiHidden="0" w:name="Dark List Accent 1"/>
     <w:lsdException w:unhideWhenUsed="0" w:uiPriority="71" w:semiHidden="0" w:name="Colorful Shading Accent 1"/>
@@ -3593,26 +3868,26 @@
     <w:lsdException w:unhideWhenUsed="0" w:uiPriority="72" w:semiHidden="0" w:name="Colorful List Accent 2"/>
     <w:lsdException w:qFormat="1" w:unhideWhenUsed="0" w:uiPriority="73" w:semiHidden="0" w:name="Colorful Grid Accent 2"/>
     <w:lsdException w:qFormat="1" w:unhideWhenUsed="0" w:uiPriority="60" w:semiHidden="0" w:name="Light Shading Accent 3"/>
-    <w:lsdException w:unhideWhenUsed="0" w:uiPriority="61" w:semiHidden="0" w:name="Light List Accent 3"/>
+    <w:lsdException w:qFormat="1" w:unhideWhenUsed="0" w:uiPriority="61" w:semiHidden="0" w:name="Light List Accent 3"/>
     <w:lsdException w:qFormat="1" w:unhideWhenUsed="0" w:uiPriority="62" w:semiHidden="0" w:name="Light Grid Accent 3"/>
     <w:lsdException w:qFormat="1" w:unhideWhenUsed="0" w:uiPriority="63" w:semiHidden="0" w:name="Medium Shading 1 Accent 3"/>
     <w:lsdException w:qFormat="1" w:unhideWhenUsed="0" w:uiPriority="64" w:semiHidden="0" w:name="Medium Shading 2 Accent 3"/>
     <w:lsdException w:qFormat="1" w:unhideWhenUsed="0" w:uiPriority="65" w:semiHidden="0" w:name="Medium List 1 Accent 3"/>
     <w:lsdException w:qFormat="1" w:unhideWhenUsed="0" w:uiPriority="66" w:semiHidden="0" w:name="Medium List 2 Accent 3"/>
-    <w:lsdException w:unhideWhenUsed="0" w:uiPriority="67" w:semiHidden="0" w:name="Medium Grid 1 Accent 3"/>
-    <w:lsdException w:unhideWhenUsed="0" w:uiPriority="68" w:semiHidden="0" w:name="Medium Grid 2 Accent 3"/>
+    <w:lsdException w:qFormat="1" w:unhideWhenUsed="0" w:uiPriority="67" w:semiHidden="0" w:name="Medium Grid 1 Accent 3"/>
+    <w:lsdException w:qFormat="1" w:unhideWhenUsed="0" w:uiPriority="68" w:semiHidden="0" w:name="Medium Grid 2 Accent 3"/>
     <w:lsdException w:qFormat="1" w:unhideWhenUsed="0" w:uiPriority="69" w:semiHidden="0" w:name="Medium Grid 3 Accent 3"/>
     <w:lsdException w:unhideWhenUsed="0" w:uiPriority="70" w:semiHidden="0" w:name="Dark List Accent 3"/>
     <w:lsdException w:unhideWhenUsed="0" w:uiPriority="71" w:semiHidden="0" w:name="Colorful Shading Accent 3"/>
     <w:lsdException w:unhideWhenUsed="0" w:uiPriority="72" w:semiHidden="0" w:name="Colorful List Accent 3"/>
     <w:lsdException w:unhideWhenUsed="0" w:uiPriority="73" w:semiHidden="0" w:name="Colorful Grid Accent 3"/>
     <w:lsdException w:qFormat="1" w:unhideWhenUsed="0" w:uiPriority="60" w:semiHidden="0" w:name="Light Shading Accent 4"/>
-    <w:lsdException w:unhideWhenUsed="0" w:uiPriority="61" w:semiHidden="0" w:name="Light List Accent 4"/>
-    <w:lsdException w:unhideWhenUsed="0" w:uiPriority="62" w:semiHidden="0" w:name="Light Grid Accent 4"/>
+    <w:lsdException w:qFormat="1" w:unhideWhenUsed="0" w:uiPriority="61" w:semiHidden="0" w:name="Light List Accent 4"/>
+    <w:lsdException w:qFormat="1" w:unhideWhenUsed="0" w:uiPriority="62" w:semiHidden="0" w:name="Light Grid Accent 4"/>
     <w:lsdException w:qFormat="1" w:unhideWhenUsed="0" w:uiPriority="63" w:semiHidden="0" w:name="Medium Shading 1 Accent 4"/>
     <w:lsdException w:qFormat="1" w:unhideWhenUsed="0" w:uiPriority="64" w:semiHidden="0" w:name="Medium Shading 2 Accent 4"/>
     <w:lsdException w:qFormat="1" w:unhideWhenUsed="0" w:uiPriority="65" w:semiHidden="0" w:name="Medium List 1 Accent 4"/>
-    <w:lsdException w:unhideWhenUsed="0" w:uiPriority="66" w:semiHidden="0" w:name="Medium List 2 Accent 4"/>
+    <w:lsdException w:qFormat="1" w:unhideWhenUsed="0" w:uiPriority="66" w:semiHidden="0" w:name="Medium List 2 Accent 4"/>
     <w:lsdException w:qFormat="1" w:unhideWhenUsed="0" w:uiPriority="67" w:semiHidden="0" w:name="Medium Grid 1 Accent 4"/>
     <w:lsdException w:qFormat="1" w:unhideWhenUsed="0" w:uiPriority="68" w:semiHidden="0" w:name="Medium Grid 2 Accent 4"/>
     <w:lsdException w:unhideWhenUsed="0" w:uiPriority="69" w:semiHidden="0" w:name="Medium Grid 3 Accent 4"/>
@@ -3622,27 +3897,27 @@
     <w:lsdException w:unhideWhenUsed="0" w:uiPriority="73" w:semiHidden="0" w:name="Colorful Grid Accent 4"/>
     <w:lsdException w:qFormat="1" w:unhideWhenUsed="0" w:uiPriority="60" w:semiHidden="0" w:name="Light Shading Accent 5"/>
     <w:lsdException w:qFormat="1" w:unhideWhenUsed="0" w:uiPriority="61" w:semiHidden="0" w:name="Light List Accent 5"/>
-    <w:lsdException w:unhideWhenUsed="0" w:uiPriority="62" w:semiHidden="0" w:name="Light Grid Accent 5"/>
+    <w:lsdException w:qFormat="1" w:unhideWhenUsed="0" w:uiPriority="62" w:semiHidden="0" w:name="Light Grid Accent 5"/>
     <w:lsdException w:qFormat="1" w:unhideWhenUsed="0" w:uiPriority="63" w:semiHidden="0" w:name="Medium Shading 1 Accent 5"/>
     <w:lsdException w:qFormat="1" w:unhideWhenUsed="0" w:uiPriority="64" w:semiHidden="0" w:name="Medium Shading 2 Accent 5"/>
     <w:lsdException w:qFormat="1" w:unhideWhenUsed="0" w:uiPriority="65" w:semiHidden="0" w:name="Medium List 1 Accent 5"/>
     <w:lsdException w:qFormat="1" w:unhideWhenUsed="0" w:uiPriority="66" w:semiHidden="0" w:name="Medium List 2 Accent 5"/>
     <w:lsdException w:qFormat="1" w:unhideWhenUsed="0" w:uiPriority="67" w:semiHidden="0" w:name="Medium Grid 1 Accent 5"/>
-    <w:lsdException w:unhideWhenUsed="0" w:uiPriority="68" w:semiHidden="0" w:name="Medium Grid 2 Accent 5"/>
+    <w:lsdException w:qFormat="1" w:unhideWhenUsed="0" w:uiPriority="68" w:semiHidden="0" w:name="Medium Grid 2 Accent 5"/>
     <w:lsdException w:unhideWhenUsed="0" w:uiPriority="69" w:semiHidden="0" w:name="Medium Grid 3 Accent 5"/>
     <w:lsdException w:qFormat="1" w:unhideWhenUsed="0" w:uiPriority="70" w:semiHidden="0" w:name="Dark List Accent 5"/>
     <w:lsdException w:unhideWhenUsed="0" w:uiPriority="71" w:semiHidden="0" w:name="Colorful Shading Accent 5"/>
     <w:lsdException w:unhideWhenUsed="0" w:uiPriority="72" w:semiHidden="0" w:name="Colorful List Accent 5"/>
-    <w:lsdException w:unhideWhenUsed="0" w:uiPriority="73" w:semiHidden="0" w:name="Colorful Grid Accent 5"/>
+    <w:lsdException w:qFormat="1" w:unhideWhenUsed="0" w:uiPriority="73" w:semiHidden="0" w:name="Colorful Grid Accent 5"/>
     <w:lsdException w:qFormat="1" w:unhideWhenUsed="0" w:uiPriority="60" w:semiHidden="0" w:name="Light Shading Accent 6"/>
     <w:lsdException w:qFormat="1" w:unhideWhenUsed="0" w:uiPriority="61" w:semiHidden="0" w:name="Light List Accent 6"/>
     <w:lsdException w:qFormat="1" w:unhideWhenUsed="0" w:uiPriority="62" w:semiHidden="0" w:name="Light Grid Accent 6"/>
     <w:lsdException w:qFormat="1" w:unhideWhenUsed="0" w:uiPriority="63" w:semiHidden="0" w:name="Medium Shading 1 Accent 6"/>
-    <w:lsdException w:unhideWhenUsed="0" w:uiPriority="64" w:semiHidden="0" w:name="Medium Shading 2 Accent 6"/>
+    <w:lsdException w:qFormat="1" w:unhideWhenUsed="0" w:uiPriority="64" w:semiHidden="0" w:name="Medium Shading 2 Accent 6"/>
     <w:lsdException w:qFormat="1" w:unhideWhenUsed="0" w:uiPriority="65" w:semiHidden="0" w:name="Medium List 1 Accent 6"/>
     <w:lsdException w:qFormat="1" w:unhideWhenUsed="0" w:uiPriority="66" w:semiHidden="0" w:name="Medium List 2 Accent 6"/>
     <w:lsdException w:qFormat="1" w:unhideWhenUsed="0" w:uiPriority="67" w:semiHidden="0" w:name="Medium Grid 1 Accent 6"/>
-    <w:lsdException w:unhideWhenUsed="0" w:uiPriority="68" w:semiHidden="0" w:name="Medium Grid 2 Accent 6"/>
+    <w:lsdException w:qFormat="1" w:unhideWhenUsed="0" w:uiPriority="68" w:semiHidden="0" w:name="Medium Grid 2 Accent 6"/>
     <w:lsdException w:unhideWhenUsed="0" w:uiPriority="69" w:semiHidden="0" w:name="Medium Grid 3 Accent 6"/>
     <w:lsdException w:unhideWhenUsed="0" w:uiPriority="70" w:semiHidden="0" w:name="Dark List Accent 6"/>
     <w:lsdException w:unhideWhenUsed="0" w:uiPriority="71" w:semiHidden="0" w:name="Colorful Shading Accent 6"/>
@@ -3903,6 +4178,7 @@
     <w:name w:val="Default Paragraph Font"/>
     <w:semiHidden/>
     <w:unhideWhenUsed/>
+    <w:qFormat/>
     <w:uiPriority w:val="1"/>
   </w:style>
   <w:style w:type="table" w:default="1" w:styleId="32">
@@ -3960,6 +4236,7 @@
     <w:name w:val="List Number 2"/>
     <w:basedOn w:val="1"/>
     <w:unhideWhenUsed/>
+    <w:qFormat/>
     <w:uiPriority w:val="99"/>
     <w:pPr>
       <w:numPr>
@@ -4962,6 +5239,7 @@
   <w:style w:type="table" w:styleId="41">
     <w:name w:val="Light List"/>
     <w:basedOn w:val="32"/>
+    <w:qFormat/>
     <w:uiPriority w:val="61"/>
     <w:pPr>
       <w:spacing w:after="0" w:line="240" w:lineRule="auto"/>
@@ -5243,6 +5521,7 @@
   <w:style w:type="table" w:styleId="44">
     <w:name w:val="Light List Accent 3"/>
     <w:basedOn w:val="32"/>
+    <w:qFormat/>
     <w:uiPriority w:val="61"/>
     <w:pPr>
       <w:spacing w:after="0" w:line="240" w:lineRule="auto"/>
@@ -5336,6 +5615,7 @@
   <w:style w:type="table" w:styleId="45">
     <w:name w:val="Light List Accent 4"/>
     <w:basedOn w:val="32"/>
+    <w:qFormat/>
     <w:uiPriority w:val="61"/>
     <w:pPr>
       <w:spacing w:after="0" w:line="240" w:lineRule="auto"/>
@@ -5617,6 +5897,7 @@
   <w:style w:type="table" w:styleId="48">
     <w:name w:val="Light Grid"/>
     <w:basedOn w:val="32"/>
+    <w:qFormat/>
     <w:uiPriority w:val="62"/>
     <w:pPr>
       <w:spacing w:after="0" w:line="240" w:lineRule="auto"/>
@@ -6124,6 +6405,7 @@
   <w:style w:type="table" w:styleId="52">
     <w:name w:val="Light Grid Accent 4"/>
     <w:basedOn w:val="32"/>
+    <w:qFormat/>
     <w:uiPriority w:val="62"/>
     <w:pPr>
       <w:spacing w:after="0" w:line="240" w:lineRule="auto"/>
@@ -6250,6 +6532,7 @@
   <w:style w:type="table" w:styleId="53">
     <w:name w:val="Light Grid Accent 5"/>
     <w:basedOn w:val="32"/>
+    <w:qFormat/>
     <w:uiPriority w:val="62"/>
     <w:pPr>
       <w:spacing w:after="0" w:line="240" w:lineRule="auto"/>
@@ -6503,6 +6786,7 @@
   <w:style w:type="table" w:styleId="55">
     <w:name w:val="Medium Shading 1"/>
     <w:basedOn w:val="32"/>
+    <w:qFormat/>
     <w:uiPriority w:val="63"/>
     <w:pPr>
       <w:spacing w:after="0" w:line="240" w:lineRule="auto"/>
@@ -6610,6 +6894,7 @@
   <w:style w:type="table" w:styleId="56">
     <w:name w:val="Medium Shading 1 Accent 1"/>
     <w:basedOn w:val="32"/>
+    <w:qFormat/>
     <w:uiPriority w:val="63"/>
     <w:pPr>
       <w:spacing w:after="0" w:line="240" w:lineRule="auto"/>
@@ -8253,6 +8538,7 @@
   <w:style w:type="table" w:styleId="68">
     <w:name w:val="Medium Shading 2 Accent 6"/>
     <w:basedOn w:val="32"/>
+    <w:qFormat/>
     <w:uiPriority w:val="64"/>
     <w:pPr>
       <w:spacing w:after="0" w:line="240" w:lineRule="auto"/>
@@ -8418,6 +8704,7 @@
   <w:style w:type="table" w:styleId="69">
     <w:name w:val="Medium List 1"/>
     <w:basedOn w:val="32"/>
+    <w:qFormat/>
     <w:uiPriority w:val="65"/>
     <w:pPr>
       <w:spacing w:after="0" w:line="240" w:lineRule="auto"/>
@@ -9184,6 +9471,7 @@
   <w:style w:type="table" w:styleId="77">
     <w:name w:val="Medium List 2 Accent 1"/>
     <w:basedOn w:val="32"/>
+    <w:qFormat/>
     <w:uiPriority w:val="66"/>
     <w:pPr>
       <w:spacing w:after="0" w:line="240" w:lineRule="auto"/>
@@ -9573,6 +9861,7 @@
   <w:style w:type="table" w:styleId="80">
     <w:name w:val="Medium List 2 Accent 4"/>
     <w:basedOn w:val="32"/>
+    <w:qFormat/>
     <w:uiPriority w:val="66"/>
     <w:pPr>
       <w:spacing w:after="0" w:line="240" w:lineRule="auto"/>
@@ -10032,6 +10321,7 @@
   <w:style w:type="table" w:styleId="84">
     <w:name w:val="Medium Grid 1 Accent 1"/>
     <w:basedOn w:val="32"/>
+    <w:qFormat/>
     <w:uiPriority w:val="67"/>
     <w:pPr>
       <w:spacing w:after="0" w:line="240" w:lineRule="auto"/>
@@ -10170,6 +10460,7 @@
   <w:style w:type="table" w:styleId="86">
     <w:name w:val="Medium Grid 1 Accent 3"/>
     <w:basedOn w:val="32"/>
+    <w:qFormat/>
     <w:uiPriority w:val="67"/>
     <w:pPr>
       <w:spacing w:after="0" w:line="240" w:lineRule="auto"/>
@@ -10449,6 +10740,7 @@
   <w:style w:type="table" w:styleId="90">
     <w:name w:val="Medium Grid 2"/>
     <w:basedOn w:val="32"/>
+    <w:qFormat/>
     <w:uiPriority w:val="68"/>
     <w:pPr>
       <w:spacing w:after="0" w:line="240" w:lineRule="auto"/>
@@ -10595,6 +10887,7 @@
   <w:style w:type="table" w:styleId="91">
     <w:name w:val="Medium Grid 2 Accent 1"/>
     <w:basedOn w:val="32"/>
+    <w:qFormat/>
     <w:uiPriority w:val="68"/>
     <w:pPr>
       <w:spacing w:after="0" w:line="240" w:lineRule="auto"/>
@@ -10888,6 +11181,7 @@
   <w:style w:type="table" w:styleId="93">
     <w:name w:val="Medium Grid 2 Accent 3"/>
     <w:basedOn w:val="32"/>
+    <w:qFormat/>
     <w:uiPriority w:val="68"/>
     <w:pPr>
       <w:spacing w:after="0" w:line="240" w:lineRule="auto"/>
@@ -11181,6 +11475,7 @@
   <w:style w:type="table" w:styleId="95">
     <w:name w:val="Medium Grid 2 Accent 5"/>
     <w:basedOn w:val="32"/>
+    <w:qFormat/>
     <w:uiPriority w:val="68"/>
     <w:pPr>
       <w:spacing w:after="0" w:line="240" w:lineRule="auto"/>
@@ -11327,6 +11622,7 @@
   <w:style w:type="table" w:styleId="96">
     <w:name w:val="Medium Grid 2 Accent 6"/>
     <w:basedOn w:val="32"/>
+    <w:qFormat/>
     <w:uiPriority w:val="68"/>
     <w:pPr>
       <w:spacing w:after="0" w:line="240" w:lineRule="auto"/>
@@ -11473,6 +11769,7 @@
   <w:style w:type="table" w:styleId="97">
     <w:name w:val="Medium Grid 3"/>
     <w:basedOn w:val="32"/>
+    <w:qFormat/>
     <w:uiPriority w:val="69"/>
     <w:pPr>
       <w:spacing w:after="0" w:line="240" w:lineRule="auto"/>
@@ -15524,6 +15821,7 @@
   <w:style w:type="table" w:styleId="130">
     <w:name w:val="Colorful Grid Accent 5"/>
     <w:basedOn w:val="32"/>
+    <w:qFormat/>
     <w:uiPriority w:val="73"/>
     <w:pPr>
       <w:spacing w:after="0" w:line="240" w:lineRule="auto"/>
@@ -15738,6 +16036,7 @@
     <w:name w:val="Header Char"/>
     <w:basedOn w:val="132"/>
     <w:link w:val="25"/>
+    <w:qFormat/>
     <w:uiPriority w:val="99"/>
   </w:style>
   <w:style w:type="character" w:customStyle="1" w:styleId="136">
@@ -15970,6 +16269,7 @@
     <w:basedOn w:val="132"/>
     <w:link w:val="8"/>
     <w:semiHidden/>
+    <w:qFormat/>
     <w:uiPriority w:val="9"/>
     <w:rPr>
       <w:rFonts w:asciiTheme="majorHAnsi" w:hAnsiTheme="majorHAnsi" w:eastAsiaTheme="majorEastAsia" w:cstheme="majorBidi"/>

</xml_diff>

<commit_message>
Mark priority speaking titles
</commit_message>
<xml_diff>
--- a/speaking-material.docx
+++ b/speaking-material.docx
@@ -1206,8 +1206,66 @@
           <w:rFonts w:ascii="Arial" w:hAnsi="Arial" w:eastAsia="微软雅黑"/>
           <w:sz w:val="20"/>
         </w:rPr>
-        <w:t>• I currently work in a research laboratory, where I plan experiments, record the results, and analyze the data. For example, one experiment kept failing, so I searched online and asked a senior lab member for help.</w:t>
+        <w:t>• I work in a research laboratory</w:t>
       </w:r>
+      <w:r>
+        <w:rPr>
+          <w:rFonts w:hint="eastAsia" w:eastAsia="微软雅黑"/>
+          <w:sz w:val="20"/>
+          <w:lang w:val="en-US" w:eastAsia="zh-CN"/>
+        </w:rPr>
+        <w:t>.</w:t>
+      </w:r>
+      <w:r>
+        <w:rPr>
+          <w:rFonts w:ascii="Arial" w:hAnsi="Arial" w:eastAsia="微软雅黑"/>
+          <w:sz w:val="20"/>
+        </w:rPr>
+        <w:t>I plan experiments, analyze the data</w:t>
+      </w:r>
+      <w:r>
+        <w:rPr>
+          <w:rFonts w:hint="eastAsia" w:eastAsia="微软雅黑"/>
+          <w:sz w:val="20"/>
+          <w:lang w:val="en-US" w:eastAsia="zh-CN"/>
+        </w:rPr>
+        <w:t xml:space="preserve"> and make some pictures</w:t>
+      </w:r>
+      <w:r>
+        <w:rPr>
+          <w:rFonts w:ascii="Arial" w:hAnsi="Arial" w:eastAsia="微软雅黑"/>
+          <w:sz w:val="20"/>
+        </w:rPr>
+        <w:t>. For example, one experiment kept failing, so I searched online and asked a senior lab member for help.</w:t>
+      </w:r>
+    </w:p>
+    <w:p>
+      <w:pPr>
+        <w:spacing w:after="20"/>
+        <w:ind w:left="173"/>
+        <w:rPr>
+          <w:rFonts w:hint="default" w:ascii="Arial" w:hAnsi="Arial" w:eastAsia="微软雅黑"/>
+          <w:sz w:val="20"/>
+          <w:lang w:val="en-US" w:eastAsia="zh-CN"/>
+        </w:rPr>
+      </w:pPr>
+      <w:r>
+        <w:rPr>
+          <w:rFonts w:ascii="Arial" w:hAnsi="Arial" w:eastAsia="微软雅黑"/>
+          <w:sz w:val="20"/>
+        </w:rPr>
+        <w:t>• I would prefer to work from home two days a week because it saves commuting time</w:t>
+      </w:r>
+      <w:r>
+        <w:rPr>
+          <w:rFonts w:hint="eastAsia" w:eastAsia="微软雅黑"/>
+          <w:sz w:val="20"/>
+          <w:lang w:val="en-US" w:eastAsia="zh-CN"/>
+        </w:rPr>
+        <w:t>.i usually go to school by xxxx.</w:t>
+      </w:r>
+      <w:bookmarkStart w:id="0" w:name="_GoBack"/>
+      <w:bookmarkEnd w:id="0"/>
     </w:p>
     <w:p>
       <w:pPr>
@@ -1219,7 +1277,7 @@
           <w:rFonts w:ascii="Arial" w:hAnsi="Arial" w:eastAsia="微软雅黑"/>
           <w:sz w:val="20"/>
         </w:rPr>
-        <w:t>• I would prefer to work from home two days a week because it saves commuting time and makes my schedule more flexible. However, I would still go to the lab when experiments or teamwork are required. This would help me keep a better work-life balance without making communication more difficult.</w:t>
+        <w:t>However, I would still go to the lab when experiments or teamwork are required. This would help me keep a better work-life balance without making communication more difficult.</w:t>
       </w:r>
     </w:p>
     <w:p>
@@ -1238,13 +1296,74 @@
       <w:pPr>
         <w:spacing w:after="20"/>
         <w:ind w:left="173"/>
+        <w:rPr>
+          <w:rFonts w:hint="default" w:ascii="Arial" w:hAnsi="Arial" w:eastAsia="微软雅黑"/>
+          <w:sz w:val="20"/>
+          <w:lang w:val="en-US"/>
+        </w:rPr>
       </w:pPr>
       <w:r>
         <w:rPr>
           <w:rFonts w:ascii="Arial" w:hAnsi="Arial" w:eastAsia="微软雅黑"/>
           <w:sz w:val="20"/>
         </w:rPr>
-        <w:t>• I use my phone and computer every day for messaging friends, reading papers, and organizing my schedule. For example, I use WeChat to stay in touch with close friends and my laptop to analyze research data. Once a program stopped working before I saved my work, so now I save my files regularly and keep a backup.</w:t>
+        <w:t xml:space="preserve">• I use my phone and computer every day for messaging friends, reading papers, and organizing my schedule. For example, I use </w:t>
+      </w:r>
+      <w:r>
+        <w:rPr>
+          <w:rFonts w:hint="eastAsia" w:eastAsia="微软雅黑"/>
+          <w:sz w:val="20"/>
+          <w:lang w:val="en-US" w:eastAsia="zh-CN"/>
+        </w:rPr>
+        <w:t>ins</w:t>
+      </w:r>
+      <w:r>
+        <w:rPr>
+          <w:rFonts w:ascii="Arial" w:hAnsi="Arial" w:eastAsia="微软雅黑"/>
+          <w:sz w:val="20"/>
+        </w:rPr>
+        <w:t xml:space="preserve"> to stay in touch with close friends</w:t>
+      </w:r>
+      <w:r>
+        <w:rPr>
+          <w:rFonts w:hint="eastAsia" w:eastAsia="微软雅黑"/>
+          <w:sz w:val="20"/>
+          <w:lang w:val="en-US" w:eastAsia="zh-CN"/>
+        </w:rPr>
+        <w:t>.iti is easily to use.i just need to open my phone,click the app,contact my friends.it saves me xxxx</w:t>
+      </w:r>
+    </w:p>
+    <w:p>
+      <w:pPr>
+        <w:spacing w:after="20"/>
+        <w:ind w:left="173"/>
+        <w:rPr>
+          <w:rFonts w:hint="default" w:eastAsia="微软雅黑"/>
+          <w:lang w:val="en-US" w:eastAsia="zh-CN"/>
+        </w:rPr>
+      </w:pPr>
+      <w:r>
+        <w:rPr>
+          <w:rFonts w:hint="eastAsia" w:eastAsia="微软雅黑"/>
+          <w:sz w:val="20"/>
+          <w:lang w:val="en-US" w:eastAsia="zh-CN"/>
+        </w:rPr>
+        <w:t xml:space="preserve">.i  also use </w:t>
+      </w:r>
+      <w:r>
+        <w:rPr>
+          <w:rFonts w:ascii="Arial" w:hAnsi="Arial" w:eastAsia="微软雅黑"/>
+          <w:sz w:val="20"/>
+        </w:rPr>
+        <w:t>my laptop to analyze research data.</w:t>
+      </w:r>
+      <w:r>
+        <w:rPr>
+          <w:rFonts w:hint="eastAsia" w:eastAsia="微软雅黑"/>
+          <w:sz w:val="20"/>
+          <w:lang w:val="en-US" w:eastAsia="zh-CN"/>
+        </w:rPr>
+        <w:t>for example,last Saturday ,i use the excel to deal with the data,and use other app to make a picture.this improves xxxx</w:t>
       </w:r>
     </w:p>
     <w:p>
@@ -1320,7 +1439,7 @@
         <w:rPr>
           <w:rFonts w:ascii="Arial" w:hAnsi="Arial" w:eastAsia="微软雅黑"/>
         </w:rPr>
-        <w:t>4｜户外活动：Hiking with friends</w:t>
+        <w:t>4｜户外活动⭐：Hiking with friends</w:t>
       </w:r>
     </w:p>
     <w:p>
@@ -1412,7 +1531,7 @@
         <w:rPr>
           <w:rFonts w:ascii="Arial" w:hAnsi="Arial" w:eastAsia="微软雅黑"/>
         </w:rPr>
-        <w:t>5｜环保：少开空调 + 太阳能板</w:t>
+        <w:t>5｜环保⭐：少开空调 + 太阳能板</w:t>
       </w:r>
     </w:p>
     <w:p>
@@ -1497,7 +1616,7 @@
         <w:rPr>
           <w:rFonts w:ascii="Arial" w:hAnsi="Arial" w:eastAsia="微软雅黑"/>
         </w:rPr>
-        <w:t>6｜种植：一株玫瑰</w:t>
+        <w:t>6｜种植⭐：一株玫瑰</w:t>
       </w:r>
     </w:p>
     <w:p>
@@ -1565,7 +1684,7 @@
         <w:rPr>
           <w:rFonts w:ascii="Arial" w:hAnsi="Arial" w:eastAsia="微软雅黑"/>
         </w:rPr>
-        <w:t>7｜天气：晴天为主</w:t>
+        <w:t>7｜天气⭐：晴天为主</w:t>
       </w:r>
     </w:p>
     <w:p>
@@ -1675,7 +1794,7 @@
         <w:rPr>
           <w:rFonts w:ascii="Arial" w:hAnsi="Arial" w:eastAsia="微软雅黑"/>
         </w:rPr>
-        <w:t>8｜极端天气：天气预报 + 雨伞</w:t>
+        <w:t>8｜极端天气⭐：天气预报 + 雨伞</w:t>
       </w:r>
     </w:p>
     <w:p>
@@ -1877,7 +1996,7 @@
         <w:rPr>
           <w:rFonts w:ascii="Arial" w:hAnsi="Arial" w:eastAsia="微软雅黑"/>
         </w:rPr>
-        <w:t>9｜睡眠：固定 schedule</w:t>
+        <w:t>9｜睡眠⭐：固定 schedule</w:t>
       </w:r>
     </w:p>
     <w:p>
@@ -1992,7 +2111,7 @@
         <w:rPr>
           <w:rFonts w:ascii="Arial" w:hAnsi="Arial" w:eastAsia="微软雅黑"/>
         </w:rPr>
-        <w:t>10｜饮食：蔬菜 + 蛋白质</w:t>
+        <w:t>10｜饮食⭐：蔬菜 + 蛋白质</w:t>
       </w:r>
     </w:p>
     <w:p>
@@ -2030,7 +2149,7 @@
         <w:rPr>
           <w:rFonts w:ascii="Arial" w:hAnsi="Arial" w:eastAsia="微软雅黑"/>
         </w:rPr>
-        <w:t>11｜消费习惯：记录支出 list</w:t>
+        <w:t>11｜消费习惯⭐：记录支出 list</w:t>
       </w:r>
     </w:p>
     <w:p>
@@ -2233,12 +2352,6 @@
         </w:rPr>
         <w:t>14｜阅读：Novel电影 action movies</w:t>
       </w:r>
-      <w:r>
-        <w:rPr>
-          <w:rFonts w:hint="eastAsia" w:ascii="Arial" w:hAnsi="Arial" w:eastAsia="微软雅黑"/>
-          <w:lang w:val="en-US" w:eastAsia="zh-CN"/>
-        </w:rPr>
-      </w:r>
     </w:p>
     <w:p>
       <w:pPr>
@@ -2327,7 +2440,7 @@
         <w:rPr>
           <w:rFonts w:ascii="Arial" w:hAnsi="Arial" w:eastAsia="微软雅黑"/>
         </w:rPr>
-        <w:t>15｜历史：长城</w:t>
+        <w:t>15｜历史⭐：长城</w:t>
       </w:r>
     </w:p>
     <w:p>
@@ -2536,16 +2649,7 @@
           <w:rFonts w:ascii="Arial" w:hAnsi="Arial" w:eastAsia="微软雅黑"/>
           <w:sz w:val="20"/>
         </w:rPr>
-        <w:t>. This gave me a chanc</w:t>
-      </w:r>
-      <w:bookmarkStart w:id="0" w:name="_GoBack"/>
-      <w:bookmarkEnd w:id="0"/>
-      <w:r>
-        <w:rPr>
-          <w:rFonts w:ascii="Arial" w:hAnsi="Arial" w:eastAsia="微软雅黑"/>
-          <w:sz w:val="20"/>
-        </w:rPr>
-        <w:t>e to help other people and made me more confident when talking to strangers.</w:t>
+        <w:t>. This gave me a chance to help other people and made me more confident when talking to strangers.</w:t>
       </w:r>
       <w:r>
         <w:rPr>
@@ -2565,7 +2669,7 @@
         <w:rPr>
           <w:rFonts w:ascii="Arial" w:hAnsi="Arial" w:eastAsia="微软雅黑"/>
         </w:rPr>
-        <w:t>17｜节日：传统美食</w:t>
+        <w:t>17｜节日⭐：传统美食</w:t>
       </w:r>
     </w:p>
     <w:p>
@@ -2633,7 +2737,7 @@
         <w:rPr>
           <w:rFonts w:ascii="Arial" w:hAnsi="Arial" w:eastAsia="微软雅黑"/>
         </w:rPr>
-        <w:t>18｜音乐：Classical music</w:t>
+        <w:t>18｜音乐⭐：Classical music</w:t>
       </w:r>
     </w:p>
     <w:p>
@@ -2751,12 +2855,6 @@
             <w:insideH w:val="single" w:color="auto" w:sz="4" w:space="0"/>
             <w:insideV w:val="single" w:color="auto" w:sz="4" w:space="0"/>
           </w:tblBorders>
-          <w:tblCellMar>
-            <w:top w:w="0" w:type="dxa"/>
-            <w:left w:w="108" w:type="dxa"/>
-            <w:bottom w:w="0" w:type="dxa"/>
-            <w:right w:w="108" w:type="dxa"/>
-          </w:tblCellMar>
         </w:tblPrEx>
         <w:trPr>
           <w:jc w:val="center"/>
@@ -2918,12 +3016,6 @@
             <w:insideH w:val="single" w:color="auto" w:sz="4" w:space="0"/>
             <w:insideV w:val="single" w:color="auto" w:sz="4" w:space="0"/>
           </w:tblBorders>
-          <w:tblCellMar>
-            <w:top w:w="0" w:type="dxa"/>
-            <w:left w:w="108" w:type="dxa"/>
-            <w:bottom w:w="0" w:type="dxa"/>
-            <w:right w:w="108" w:type="dxa"/>
-          </w:tblCellMar>
         </w:tblPrEx>
         <w:trPr>
           <w:jc w:val="center"/>
@@ -3138,12 +3230,6 @@
             <w:insideH w:val="single" w:color="auto" w:sz="4" w:space="0"/>
             <w:insideV w:val="single" w:color="auto" w:sz="4" w:space="0"/>
           </w:tblBorders>
-          <w:tblCellMar>
-            <w:top w:w="0" w:type="dxa"/>
-            <w:left w:w="108" w:type="dxa"/>
-            <w:bottom w:w="0" w:type="dxa"/>
-            <w:right w:w="108" w:type="dxa"/>
-          </w:tblCellMar>
         </w:tblPrEx>
         <w:trPr>
           <w:jc w:val="center"/>
@@ -3358,12 +3444,6 @@
             <w:insideH w:val="single" w:color="auto" w:sz="4" w:space="0"/>
             <w:insideV w:val="single" w:color="auto" w:sz="4" w:space="0"/>
           </w:tblBorders>
-          <w:tblCellMar>
-            <w:top w:w="0" w:type="dxa"/>
-            <w:left w:w="108" w:type="dxa"/>
-            <w:bottom w:w="0" w:type="dxa"/>
-            <w:right w:w="108" w:type="dxa"/>
-          </w:tblCellMar>
         </w:tblPrEx>
         <w:trPr>
           <w:jc w:val="center"/>
@@ -3832,10 +3912,10 @@
     <w:lsdException w:qFormat="1" w:unhideWhenUsed="0" w:uiPriority="67" w:semiHidden="0" w:name="Medium Grid 1"/>
     <w:lsdException w:qFormat="1" w:unhideWhenUsed="0" w:uiPriority="68" w:semiHidden="0" w:name="Medium Grid 2"/>
     <w:lsdException w:qFormat="1" w:unhideWhenUsed="0" w:uiPriority="69" w:semiHidden="0" w:name="Medium Grid 3"/>
-    <w:lsdException w:unhideWhenUsed="0" w:uiPriority="70" w:semiHidden="0" w:name="Dark List"/>
-    <w:lsdException w:unhideWhenUsed="0" w:uiPriority="71" w:semiHidden="0" w:name="Colorful Shading"/>
-    <w:lsdException w:unhideWhenUsed="0" w:uiPriority="72" w:semiHidden="0" w:name="Colorful List"/>
-    <w:lsdException w:unhideWhenUsed="0" w:uiPriority="73" w:semiHidden="0" w:name="Colorful Grid"/>
+    <w:lsdException w:qFormat="1" w:unhideWhenUsed="0" w:uiPriority="70" w:semiHidden="0" w:name="Dark List"/>
+    <w:lsdException w:qFormat="1" w:unhideWhenUsed="0" w:uiPriority="71" w:semiHidden="0" w:name="Colorful Shading"/>
+    <w:lsdException w:qFormat="1" w:unhideWhenUsed="0" w:uiPriority="72" w:semiHidden="0" w:name="Colorful List"/>
+    <w:lsdException w:qFormat="1" w:unhideWhenUsed="0" w:uiPriority="73" w:semiHidden="0" w:name="Colorful Grid"/>
     <w:lsdException w:qFormat="1" w:unhideWhenUsed="0" w:uiPriority="60" w:semiHidden="0" w:name="Light Shading Accent 1"/>
     <w:lsdException w:qFormat="1" w:unhideWhenUsed="0" w:uiPriority="61" w:semiHidden="0" w:name="Light List Accent 1"/>
     <w:lsdException w:qFormat="1" w:unhideWhenUsed="0" w:uiPriority="62" w:semiHidden="0" w:name="Light Grid Accent 1"/>
@@ -3850,9 +3930,9 @@
     <w:lsdException w:qFormat="1" w:unhideWhenUsed="0" w:uiPriority="68" w:semiHidden="0" w:name="Medium Grid 2 Accent 1"/>
     <w:lsdException w:qFormat="1" w:unhideWhenUsed="0" w:uiPriority="69" w:semiHidden="0" w:name="Medium Grid 3 Accent 1"/>
     <w:lsdException w:qFormat="1" w:unhideWhenUsed="0" w:uiPriority="70" w:semiHidden="0" w:name="Dark List Accent 1"/>
-    <w:lsdException w:unhideWhenUsed="0" w:uiPriority="71" w:semiHidden="0" w:name="Colorful Shading Accent 1"/>
+    <w:lsdException w:qFormat="1" w:unhideWhenUsed="0" w:uiPriority="71" w:semiHidden="0" w:name="Colorful Shading Accent 1"/>
     <w:lsdException w:qFormat="1" w:unhideWhenUsed="0" w:uiPriority="72" w:semiHidden="0" w:name="Colorful List Accent 1"/>
-    <w:lsdException w:unhideWhenUsed="0" w:uiPriority="73" w:semiHidden="0" w:name="Colorful Grid Accent 1"/>
+    <w:lsdException w:qFormat="1" w:unhideWhenUsed="0" w:uiPriority="73" w:semiHidden="0" w:name="Colorful Grid Accent 1"/>
     <w:lsdException w:qFormat="1" w:unhideWhenUsed="0" w:uiPriority="60" w:semiHidden="0" w:name="Light Shading Accent 2"/>
     <w:lsdException w:qFormat="1" w:unhideWhenUsed="0" w:uiPriority="61" w:semiHidden="0" w:name="Light List Accent 2"/>
     <w:lsdException w:qFormat="1" w:unhideWhenUsed="0" w:uiPriority="62" w:semiHidden="0" w:name="Light Grid Accent 2"/>
@@ -3860,12 +3940,12 @@
     <w:lsdException w:qFormat="1" w:unhideWhenUsed="0" w:uiPriority="64" w:semiHidden="0" w:name="Medium Shading 2 Accent 2"/>
     <w:lsdException w:qFormat="1" w:unhideWhenUsed="0" w:uiPriority="65" w:semiHidden="0" w:name="Medium List 1 Accent 2"/>
     <w:lsdException w:qFormat="1" w:unhideWhenUsed="0" w:uiPriority="66" w:semiHidden="0" w:name="Medium List 2 Accent 2"/>
-    <w:lsdException w:unhideWhenUsed="0" w:uiPriority="67" w:semiHidden="0" w:name="Medium Grid 1 Accent 2"/>
+    <w:lsdException w:qFormat="1" w:unhideWhenUsed="0" w:uiPriority="67" w:semiHidden="0" w:name="Medium Grid 1 Accent 2"/>
     <w:lsdException w:qFormat="1" w:unhideWhenUsed="0" w:uiPriority="68" w:semiHidden="0" w:name="Medium Grid 2 Accent 2"/>
-    <w:lsdException w:unhideWhenUsed="0" w:uiPriority="69" w:semiHidden="0" w:name="Medium Grid 3 Accent 2"/>
-    <w:lsdException w:unhideWhenUsed="0" w:uiPriority="70" w:semiHidden="0" w:name="Dark List Accent 2"/>
+    <w:lsdException w:qFormat="1" w:unhideWhenUsed="0" w:uiPriority="69" w:semiHidden="0" w:name="Medium Grid 3 Accent 2"/>
+    <w:lsdException w:qFormat="1" w:unhideWhenUsed="0" w:uiPriority="70" w:semiHidden="0" w:name="Dark List Accent 2"/>
     <w:lsdException w:qFormat="1" w:unhideWhenUsed="0" w:uiPriority="71" w:semiHidden="0" w:name="Colorful Shading Accent 2"/>
-    <w:lsdException w:unhideWhenUsed="0" w:uiPriority="72" w:semiHidden="0" w:name="Colorful List Accent 2"/>
+    <w:lsdException w:qFormat="1" w:unhideWhenUsed="0" w:uiPriority="72" w:semiHidden="0" w:name="Colorful List Accent 2"/>
     <w:lsdException w:qFormat="1" w:unhideWhenUsed="0" w:uiPriority="73" w:semiHidden="0" w:name="Colorful Grid Accent 2"/>
     <w:lsdException w:qFormat="1" w:unhideWhenUsed="0" w:uiPriority="60" w:semiHidden="0" w:name="Light Shading Accent 3"/>
     <w:lsdException w:qFormat="1" w:unhideWhenUsed="0" w:uiPriority="61" w:semiHidden="0" w:name="Light List Accent 3"/>
@@ -3877,10 +3957,10 @@
     <w:lsdException w:qFormat="1" w:unhideWhenUsed="0" w:uiPriority="67" w:semiHidden="0" w:name="Medium Grid 1 Accent 3"/>
     <w:lsdException w:qFormat="1" w:unhideWhenUsed="0" w:uiPriority="68" w:semiHidden="0" w:name="Medium Grid 2 Accent 3"/>
     <w:lsdException w:qFormat="1" w:unhideWhenUsed="0" w:uiPriority="69" w:semiHidden="0" w:name="Medium Grid 3 Accent 3"/>
-    <w:lsdException w:unhideWhenUsed="0" w:uiPriority="70" w:semiHidden="0" w:name="Dark List Accent 3"/>
-    <w:lsdException w:unhideWhenUsed="0" w:uiPriority="71" w:semiHidden="0" w:name="Colorful Shading Accent 3"/>
+    <w:lsdException w:qFormat="1" w:unhideWhenUsed="0" w:uiPriority="70" w:semiHidden="0" w:name="Dark List Accent 3"/>
+    <w:lsdException w:qFormat="1" w:unhideWhenUsed="0" w:uiPriority="71" w:semiHidden="0" w:name="Colorful Shading Accent 3"/>
     <w:lsdException w:unhideWhenUsed="0" w:uiPriority="72" w:semiHidden="0" w:name="Colorful List Accent 3"/>
-    <w:lsdException w:unhideWhenUsed="0" w:uiPriority="73" w:semiHidden="0" w:name="Colorful Grid Accent 3"/>
+    <w:lsdException w:qFormat="1" w:unhideWhenUsed="0" w:uiPriority="73" w:semiHidden="0" w:name="Colorful Grid Accent 3"/>
     <w:lsdException w:qFormat="1" w:unhideWhenUsed="0" w:uiPriority="60" w:semiHidden="0" w:name="Light Shading Accent 4"/>
     <w:lsdException w:qFormat="1" w:unhideWhenUsed="0" w:uiPriority="61" w:semiHidden="0" w:name="Light List Accent 4"/>
     <w:lsdException w:qFormat="1" w:unhideWhenUsed="0" w:uiPriority="62" w:semiHidden="0" w:name="Light Grid Accent 4"/>
@@ -3890,8 +3970,8 @@
     <w:lsdException w:qFormat="1" w:unhideWhenUsed="0" w:uiPriority="66" w:semiHidden="0" w:name="Medium List 2 Accent 4"/>
     <w:lsdException w:qFormat="1" w:unhideWhenUsed="0" w:uiPriority="67" w:semiHidden="0" w:name="Medium Grid 1 Accent 4"/>
     <w:lsdException w:qFormat="1" w:unhideWhenUsed="0" w:uiPriority="68" w:semiHidden="0" w:name="Medium Grid 2 Accent 4"/>
-    <w:lsdException w:unhideWhenUsed="0" w:uiPriority="69" w:semiHidden="0" w:name="Medium Grid 3 Accent 4"/>
-    <w:lsdException w:unhideWhenUsed="0" w:uiPriority="70" w:semiHidden="0" w:name="Dark List Accent 4"/>
+    <w:lsdException w:qFormat="1" w:unhideWhenUsed="0" w:uiPriority="69" w:semiHidden="0" w:name="Medium Grid 3 Accent 4"/>
+    <w:lsdException w:qFormat="1" w:unhideWhenUsed="0" w:uiPriority="70" w:semiHidden="0" w:name="Dark List Accent 4"/>
     <w:lsdException w:unhideWhenUsed="0" w:uiPriority="71" w:semiHidden="0" w:name="Colorful Shading Accent 4"/>
     <w:lsdException w:unhideWhenUsed="0" w:uiPriority="72" w:semiHidden="0" w:name="Colorful List Accent 4"/>
     <w:lsdException w:unhideWhenUsed="0" w:uiPriority="73" w:semiHidden="0" w:name="Colorful Grid Accent 4"/>
@@ -3904,9 +3984,9 @@
     <w:lsdException w:qFormat="1" w:unhideWhenUsed="0" w:uiPriority="66" w:semiHidden="0" w:name="Medium List 2 Accent 5"/>
     <w:lsdException w:qFormat="1" w:unhideWhenUsed="0" w:uiPriority="67" w:semiHidden="0" w:name="Medium Grid 1 Accent 5"/>
     <w:lsdException w:qFormat="1" w:unhideWhenUsed="0" w:uiPriority="68" w:semiHidden="0" w:name="Medium Grid 2 Accent 5"/>
-    <w:lsdException w:unhideWhenUsed="0" w:uiPriority="69" w:semiHidden="0" w:name="Medium Grid 3 Accent 5"/>
+    <w:lsdException w:qFormat="1" w:unhideWhenUsed="0" w:uiPriority="69" w:semiHidden="0" w:name="Medium Grid 3 Accent 5"/>
     <w:lsdException w:qFormat="1" w:unhideWhenUsed="0" w:uiPriority="70" w:semiHidden="0" w:name="Dark List Accent 5"/>
-    <w:lsdException w:unhideWhenUsed="0" w:uiPriority="71" w:semiHidden="0" w:name="Colorful Shading Accent 5"/>
+    <w:lsdException w:qFormat="1" w:unhideWhenUsed="0" w:uiPriority="71" w:semiHidden="0" w:name="Colorful Shading Accent 5"/>
     <w:lsdException w:unhideWhenUsed="0" w:uiPriority="72" w:semiHidden="0" w:name="Colorful List Accent 5"/>
     <w:lsdException w:qFormat="1" w:unhideWhenUsed="0" w:uiPriority="73" w:semiHidden="0" w:name="Colorful Grid Accent 5"/>
     <w:lsdException w:qFormat="1" w:unhideWhenUsed="0" w:uiPriority="60" w:semiHidden="0" w:name="Light Shading Accent 6"/>
@@ -3918,9 +3998,9 @@
     <w:lsdException w:qFormat="1" w:unhideWhenUsed="0" w:uiPriority="66" w:semiHidden="0" w:name="Medium List 2 Accent 6"/>
     <w:lsdException w:qFormat="1" w:unhideWhenUsed="0" w:uiPriority="67" w:semiHidden="0" w:name="Medium Grid 1 Accent 6"/>
     <w:lsdException w:qFormat="1" w:unhideWhenUsed="0" w:uiPriority="68" w:semiHidden="0" w:name="Medium Grid 2 Accent 6"/>
-    <w:lsdException w:unhideWhenUsed="0" w:uiPriority="69" w:semiHidden="0" w:name="Medium Grid 3 Accent 6"/>
-    <w:lsdException w:unhideWhenUsed="0" w:uiPriority="70" w:semiHidden="0" w:name="Dark List Accent 6"/>
-    <w:lsdException w:unhideWhenUsed="0" w:uiPriority="71" w:semiHidden="0" w:name="Colorful Shading Accent 6"/>
+    <w:lsdException w:qFormat="1" w:unhideWhenUsed="0" w:uiPriority="69" w:semiHidden="0" w:name="Medium Grid 3 Accent 6"/>
+    <w:lsdException w:qFormat="1" w:unhideWhenUsed="0" w:uiPriority="70" w:semiHidden="0" w:name="Dark List Accent 6"/>
+    <w:lsdException w:qFormat="1" w:unhideWhenUsed="0" w:uiPriority="71" w:semiHidden="0" w:name="Colorful Shading Accent 6"/>
     <w:lsdException w:unhideWhenUsed="0" w:uiPriority="72" w:semiHidden="0" w:name="Colorful List Accent 6"/>
     <w:lsdException w:qFormat="1" w:unhideWhenUsed="0" w:uiPriority="73" w:semiHidden="0" w:name="Colorful Grid Accent 6"/>
   </w:latentStyles>
@@ -10391,6 +10471,7 @@
   <w:style w:type="table" w:styleId="85">
     <w:name w:val="Medium Grid 1 Accent 2"/>
     <w:basedOn w:val="32"/>
+    <w:qFormat/>
     <w:uiPriority w:val="67"/>
     <w:pPr>
       <w:spacing w:after="0" w:line="240" w:lineRule="auto"/>
@@ -12085,6 +12166,7 @@
   <w:style w:type="table" w:styleId="99">
     <w:name w:val="Medium Grid 3 Accent 2"/>
     <w:basedOn w:val="32"/>
+    <w:qFormat/>
     <w:uiPriority w:val="69"/>
     <w:pPr>
       <w:spacing w:after="0" w:line="240" w:lineRule="auto"/>
@@ -12400,6 +12482,7 @@
   <w:style w:type="table" w:styleId="101">
     <w:name w:val="Medium Grid 3 Accent 4"/>
     <w:basedOn w:val="32"/>
+    <w:qFormat/>
     <w:uiPriority w:val="69"/>
     <w:pPr>
       <w:spacing w:after="0" w:line="240" w:lineRule="auto"/>
@@ -12557,6 +12640,7 @@
   <w:style w:type="table" w:styleId="102">
     <w:name w:val="Medium Grid 3 Accent 5"/>
     <w:basedOn w:val="32"/>
+    <w:qFormat/>
     <w:uiPriority w:val="69"/>
     <w:pPr>
       <w:spacing w:after="0" w:line="240" w:lineRule="auto"/>
@@ -12714,6 +12798,7 @@
   <w:style w:type="table" w:styleId="103">
     <w:name w:val="Medium Grid 3 Accent 6"/>
     <w:basedOn w:val="32"/>
+    <w:qFormat/>
     <w:uiPriority w:val="69"/>
     <w:pPr>
       <w:spacing w:after="0" w:line="240" w:lineRule="auto"/>
@@ -12871,6 +12956,7 @@
   <w:style w:type="table" w:styleId="104">
     <w:name w:val="Dark List"/>
     <w:basedOn w:val="32"/>
+    <w:qFormat/>
     <w:uiPriority w:val="70"/>
     <w:pPr>
       <w:spacing w:after="0" w:line="240" w:lineRule="auto"/>
@@ -13102,6 +13188,7 @@
   <w:style w:type="table" w:styleId="106">
     <w:name w:val="Dark List Accent 2"/>
     <w:basedOn w:val="32"/>
+    <w:qFormat/>
     <w:uiPriority w:val="70"/>
     <w:pPr>
       <w:spacing w:after="0" w:line="240" w:lineRule="auto"/>
@@ -13217,6 +13304,7 @@
   <w:style w:type="table" w:styleId="107">
     <w:name w:val="Dark List Accent 3"/>
     <w:basedOn w:val="32"/>
+    <w:qFormat/>
     <w:uiPriority w:val="70"/>
     <w:pPr>
       <w:spacing w:after="0" w:line="240" w:lineRule="auto"/>
@@ -13332,6 +13420,7 @@
   <w:style w:type="table" w:styleId="108">
     <w:name w:val="Dark List Accent 4"/>
     <w:basedOn w:val="32"/>
+    <w:qFormat/>
     <w:uiPriority w:val="70"/>
     <w:pPr>
       <w:spacing w:after="0" w:line="240" w:lineRule="auto"/>
@@ -13563,6 +13652,7 @@
   <w:style w:type="table" w:styleId="110">
     <w:name w:val="Dark List Accent 6"/>
     <w:basedOn w:val="32"/>
+    <w:qFormat/>
     <w:uiPriority w:val="70"/>
     <w:pPr>
       <w:spacing w:after="0" w:line="240" w:lineRule="auto"/>
@@ -13678,6 +13768,7 @@
   <w:style w:type="table" w:styleId="111">
     <w:name w:val="Colorful Shading"/>
     <w:basedOn w:val="32"/>
+    <w:qFormat/>
     <w:uiPriority w:val="71"/>
     <w:pPr>
       <w:spacing w:after="0" w:line="240" w:lineRule="auto"/>
@@ -13826,6 +13917,7 @@
   <w:style w:type="table" w:styleId="112">
     <w:name w:val="Colorful Shading Accent 1"/>
     <w:basedOn w:val="32"/>
+    <w:qFormat/>
     <w:uiPriority w:val="71"/>
     <w:pPr>
       <w:spacing w:after="0" w:line="240" w:lineRule="auto"/>
@@ -14123,6 +14215,7 @@
   <w:style w:type="table" w:styleId="114">
     <w:name w:val="Colorful Shading Accent 3"/>
     <w:basedOn w:val="32"/>
+    <w:qFormat/>
     <w:uiPriority w:val="71"/>
     <w:pPr>
       <w:spacing w:after="0" w:line="240" w:lineRule="auto"/>
@@ -14399,6 +14492,7 @@
   <w:style w:type="table" w:styleId="116">
     <w:name w:val="Colorful Shading Accent 5"/>
     <w:basedOn w:val="32"/>
+    <w:qFormat/>
     <w:uiPriority w:val="71"/>
     <w:pPr>
       <w:spacing w:after="0" w:line="240" w:lineRule="auto"/>
@@ -14547,6 +14641,7 @@
   <w:style w:type="table" w:styleId="117">
     <w:name w:val="Colorful Shading Accent 6"/>
     <w:basedOn w:val="32"/>
+    <w:qFormat/>
     <w:uiPriority w:val="71"/>
     <w:pPr>
       <w:spacing w:after="0" w:line="240" w:lineRule="auto"/>
@@ -14695,6 +14790,7 @@
   <w:style w:type="table" w:styleId="118">
     <w:name w:val="Colorful List"/>
     <w:basedOn w:val="32"/>
+    <w:qFormat/>
     <w:uiPriority w:val="72"/>
     <w:pPr>
       <w:spacing w:after="0" w:line="240" w:lineRule="auto"/>
@@ -14880,6 +14976,7 @@
   <w:style w:type="table" w:styleId="120">
     <w:name w:val="Colorful List Accent 2"/>
     <w:basedOn w:val="32"/>
+    <w:qFormat/>
     <w:uiPriority w:val="72"/>
     <w:pPr>
       <w:spacing w:after="0" w:line="240" w:lineRule="auto"/>
@@ -15340,6 +15437,7 @@
   <w:style w:type="table" w:styleId="125">
     <w:name w:val="Colorful Grid"/>
     <w:basedOn w:val="32"/>
+    <w:qFormat/>
     <w:uiPriority w:val="73"/>
     <w:pPr>
       <w:spacing w:after="0" w:line="240" w:lineRule="auto"/>
@@ -15436,6 +15534,7 @@
   <w:style w:type="table" w:styleId="126">
     <w:name w:val="Colorful Grid Accent 1"/>
     <w:basedOn w:val="32"/>
+    <w:qFormat/>
     <w:uiPriority w:val="73"/>
     <w:pPr>
       <w:spacing w:after="0" w:line="240" w:lineRule="auto"/>
@@ -15629,6 +15728,7 @@
   <w:style w:type="table" w:styleId="128">
     <w:name w:val="Colorful Grid Accent 3"/>
     <w:basedOn w:val="32"/>
+    <w:qFormat/>
     <w:uiPriority w:val="73"/>
     <w:pPr>
       <w:spacing w:after="0" w:line="240" w:lineRule="auto"/>

</xml_diff>